<commit_message>
Remove date and time from printed ticket and center number
</commit_message>
<xml_diff>
--- a/templates/ticket_template.docx
+++ b/templates/ticket_template.docx
@@ -1,6 +1,6 @@
 
 <file path=word/document.xml><?xml version="1.0" encoding="utf-8"?>
-<w:document xmlns:wpc="http://schemas.microsoft.com/office/word/2010/wordprocessingCanvas" xmlns:cx="http://schemas.microsoft.com/office/drawing/2014/chartex" xmlns:cx1="http://schemas.microsoft.com/office/drawing/2015/9/8/chartex" xmlns:cx2="http://schemas.microsoft.com/office/drawing/2015/10/21/chartex" xmlns:cx3="http://schemas.microsoft.com/office/drawing/2016/5/9/chartex" xmlns:cx4="http://schemas.microsoft.com/office/drawing/2016/5/10/chartex" xmlns:cx5="http://schemas.microsoft.com/office/drawing/2016/5/11/chartex" xmlns:cx6="http://schemas.microsoft.com/office/drawing/2016/5/12/chartex" xmlns:cx7="http://schemas.microsoft.com/office/drawing/2016/5/13/chartex" xmlns:cx8="http://schemas.microsoft.com/office/drawing/2016/5/14/chartex" xmlns:mc="http://schemas.openxmlformats.org/markup-compatibility/2006" xmlns:aink="http://schemas.microsoft.com/office/drawing/2016/ink" xmlns:am3d="http://schemas.microsoft.com/office/drawing/2017/model3d" xmlns:o="urn:schemas-microsoft-com:office:office" xmlns:oel="http://schemas.microsoft.com/office/2019/extlst" xmlns:r="http://schemas.openxmlformats.org/officeDocument/2006/relationships" xmlns:m="http://schemas.openxmlformats.org/officeDocument/2006/math" xmlns:v="urn:schemas-microsoft-com:vml" xmlns:wp14="http://schemas.microsoft.com/office/word/2010/wordprocessingDrawing" xmlns:wp="http://schemas.openxmlformats.org/drawingml/2006/wordprocessingDrawing" xmlns:w10="urn:schemas-microsoft-com:office:word" xmlns:w="http://schemas.openxmlformats.org/wordprocessingml/2006/main" xmlns:w14="http://schemas.microsoft.com/office/word/2010/wordml" xmlns:w15="http://schemas.microsoft.com/office/word/2012/wordml" xmlns:w16cei="http://schemas.microsoft.com/office/word/2026/wordml/cei" xmlns:w16cex="http://schemas.microsoft.com/office/word/2018/wordml/cex" xmlns:w16cid="http://schemas.microsoft.com/office/word/2016/wordml/cid" xmlns:w16="http://schemas.microsoft.com/office/word/2018/wordml" xmlns:w16du="http://schemas.microsoft.com/office/word/2023/wordml/word16du" xmlns:w16sdtdh="http://schemas.microsoft.com/office/word/2020/wordml/sdtdatahash" xmlns:w16sdtfl="http://schemas.microsoft.com/office/word/2024/wordml/sdtformatlock" xmlns:w16se="http://schemas.microsoft.com/office/word/2015/wordml/symex" xmlns:wpg="http://schemas.microsoft.com/office/word/2010/wordprocessingGroup" xmlns:wpi="http://schemas.microsoft.com/office/word/2010/wordprocessingInk" xmlns:wne="http://schemas.microsoft.com/office/word/2006/wordml" xmlns:wps="http://schemas.microsoft.com/office/word/2010/wordprocessingShape" mc:Ignorable="w14 w15 w16se w16cid w16 w16cex w16sdtdh w16sdtfl w16du wp14">
+<w:document xmlns:wpc="http://schemas.microsoft.com/office/word/2010/wordprocessingCanvas" xmlns:cx="http://schemas.microsoft.com/office/drawing/2014/chartex" xmlns:cx1="http://schemas.microsoft.com/office/drawing/2015/9/8/chartex" xmlns:cx2="http://schemas.microsoft.com/office/drawing/2015/10/21/chartex" xmlns:cx3="http://schemas.microsoft.com/office/drawing/2016/5/9/chartex" xmlns:cx4="http://schemas.microsoft.com/office/drawing/2016/5/10/chartex" xmlns:cx5="http://schemas.microsoft.com/office/drawing/2016/5/11/chartex" xmlns:cx6="http://schemas.microsoft.com/office/drawing/2016/5/12/chartex" xmlns:cx7="http://schemas.microsoft.com/office/drawing/2016/5/13/chartex" xmlns:cx8="http://schemas.microsoft.com/office/drawing/2016/5/14/chartex" xmlns:mc="http://schemas.openxmlformats.org/markup-compatibility/2006" xmlns:aink="http://schemas.microsoft.com/office/drawing/2016/ink" xmlns:am3d="http://schemas.microsoft.com/office/drawing/2017/model3d" xmlns:o="urn:schemas-microsoft-com:office:office" xmlns:oel="http://schemas.microsoft.com/office/2019/extlst" xmlns:r="http://schemas.openxmlformats.org/officeDocument/2006/relationships" xmlns:m="http://schemas.openxmlformats.org/officeDocument/2006/math" xmlns:v="urn:schemas-microsoft-com:vml" xmlns:wp14="http://schemas.microsoft.com/office/word/2010/wordprocessingDrawing" xmlns:wp="http://schemas.openxmlformats.org/drawingml/2006/wordprocessingDrawing" xmlns:w10="urn:schemas-microsoft-com:office:word" xmlns:w="http://schemas.openxmlformats.org/wordprocessingml/2006/main" xmlns:w14="http://schemas.microsoft.com/office/word/2010/wordml" xmlns:w15="http://schemas.microsoft.com/office/word/2012/wordml" xmlns:w16cex="http://schemas.microsoft.com/office/word/2018/wordml/cex" xmlns:w16cid="http://schemas.microsoft.com/office/word/2016/wordml/cid" xmlns:w16="http://schemas.microsoft.com/office/word/2018/wordml" xmlns:w16sdtdh="http://schemas.microsoft.com/office/word/2020/wordml/sdtdatahash" xmlns:w16se="http://schemas.microsoft.com/office/word/2015/wordml/symex" xmlns:wpg="http://schemas.microsoft.com/office/word/2010/wordprocessingGroup" xmlns:wpi="http://schemas.microsoft.com/office/word/2010/wordprocessingInk" xmlns:wne="http://schemas.microsoft.com/office/word/2006/wordml" xmlns:wps="http://schemas.microsoft.com/office/word/2010/wordprocessingShape" mc:Ignorable="w14 w15 w16se w16cid w16 w16cex w16sdtdh wp14">
   <w:body>
     <w:p>
       <w:r>
@@ -10,16 +10,16 @@
         <mc:AlternateContent>
           <mc:Choice Requires="wps">
             <w:drawing>
-              <wp:anchor distT="45720" distB="45720" distL="114300" distR="114300" simplePos="0" relativeHeight="251667456" behindDoc="0" locked="0" layoutInCell="1" allowOverlap="1" wp14:anchorId="0E7C65A4" wp14:editId="00890C2C">
+              <wp:anchor distT="45720" distB="45720" distL="114300" distR="114300" simplePos="0" relativeHeight="251667456" behindDoc="0" locked="0" layoutInCell="1" allowOverlap="1" wp14:anchorId="0E7C65A4" wp14:editId="52960815">
                 <wp:simplePos x="0" y="0"/>
                 <wp:positionH relativeFrom="margin">
-                  <wp:posOffset>281940</wp:posOffset>
+                  <wp:posOffset>300990</wp:posOffset>
                 </wp:positionH>
                 <wp:positionV relativeFrom="paragraph">
-                  <wp:posOffset>807720</wp:posOffset>
+                  <wp:posOffset>751840</wp:posOffset>
                 </wp:positionV>
-                <wp:extent cx="1363980" cy="522605"/>
-                <wp:effectExtent l="0" t="0" r="0" b="0"/>
+                <wp:extent cx="1363980" cy="299720"/>
+                <wp:effectExtent l="0" t="0" r="0" b="5080"/>
                 <wp:wrapSquare wrapText="bothSides"/>
                 <wp:docPr id="245594899" name="Text Box 2"/>
                 <wp:cNvGraphicFramePr>
@@ -34,7 +34,7 @@
                       <wps:spPr bwMode="auto">
                         <a:xfrm>
                           <a:off x="0" y="0"/>
-                          <a:ext cx="1363980" cy="522605"/>
+                          <a:ext cx="1363980" cy="299720"/>
                         </a:xfrm>
                         <a:prstGeom prst="rect">
                           <a:avLst/>
@@ -62,26 +62,146 @@
                         <w:txbxContent>
                           <w:p>
                             <w:pPr>
-                              <w:jc w:val="right"/>
-                              <w:rPr>
-                                <w:b/>
-                                <w:bCs/>
-                                <w:sz w:val="40"/>
-                                <w:szCs w:val="40"/>
+                              <w:jc w:val="center"/>
+                              <w:rPr>
+                                <w:b/>
+                                <w:bCs/>
+                                <w:sz w:val="32"/>
+                                <w:szCs w:val="32"/>
                                 <w:lang w:bidi="ar-EG"/>
                               </w:rPr>
                             </w:pPr>
                             <w:r>
                               <w:rPr>
-                                <w:rFonts w:hint="cs"/>
-                                <w:b/>
-                                <w:bCs/>
-                                <w:sz w:val="40"/>
-                                <w:szCs w:val="40"/>
-                                <w:rtl/>
-                                <w:lang w:bidi="ar-EG"/>
-                              </w:rPr>
-                              <w:t xml:space="preserve">رقم: </w:t>
+                                <w:rFonts w:cs="Arial" w:hint="cs"/>
+                                <w:b/>
+                                <w:bCs/>
+                                <w:sz w:val="32"/>
+                                <w:szCs w:val="32"/>
+                                <w:rtl/>
+                                <w:lang w:bidi="ar-EG"/>
+                              </w:rPr>
+                              <w:t>رق</w:t>
+                            </w:r>
+                            <w:r>
+                              <w:rPr>
+                                <w:rFonts w:cs="Arial" w:hint="cs"/>
+                                <w:b/>
+                                <w:bCs/>
+                                <w:sz w:val="32"/>
+                                <w:szCs w:val="32"/>
+                                <w:rtl/>
+                                <w:lang w:bidi="ar-EG"/>
+                              </w:rPr>
+                              <w:t>ـ</w:t>
+                            </w:r>
+                            <w:r>
+                              <w:rPr>
+                                <w:rFonts w:cs="Arial" w:hint="cs"/>
+                                <w:b/>
+                                <w:bCs/>
+                                <w:sz w:val="32"/>
+                                <w:szCs w:val="32"/>
+                                <w:rtl/>
+                                <w:lang w:bidi="ar-EG"/>
+                              </w:rPr>
+                              <w:t>م</w:t>
+                            </w:r>
+                            <w:r>
+                              <w:rPr>
+                                <w:rFonts w:cs="Arial"/>
+                                <w:b/>
+                                <w:bCs/>
+                                <w:sz w:val="32"/>
+                                <w:szCs w:val="32"/>
+                                <w:rtl/>
+                                <w:lang w:bidi="ar-EG"/>
+                              </w:rPr>
+                              <w:t xml:space="preserve"> </w:t>
+                            </w:r>
+                            <w:r>
+                              <w:rPr>
+                                <w:rFonts w:cs="Arial" w:hint="cs"/>
+                                <w:b/>
+                                <w:bCs/>
+                                <w:sz w:val="32"/>
+                                <w:szCs w:val="32"/>
+                                <w:rtl/>
+                                <w:lang w:bidi="ar-EG"/>
+                              </w:rPr>
+                              <w:t>ال</w:t>
+                            </w:r>
+                            <w:r>
+                              <w:rPr>
+                                <w:rFonts w:cs="Arial" w:hint="cs"/>
+                                <w:b/>
+                                <w:bCs/>
+                                <w:sz w:val="32"/>
+                                <w:szCs w:val="32"/>
+                                <w:rtl/>
+                                <w:lang w:bidi="ar-EG"/>
+                              </w:rPr>
+                              <w:t>ا</w:t>
+                            </w:r>
+                            <w:r>
+                              <w:rPr>
+                                <w:rFonts w:cs="Arial" w:hint="cs"/>
+                                <w:b/>
+                                <w:bCs/>
+                                <w:sz w:val="32"/>
+                                <w:szCs w:val="32"/>
+                                <w:rtl/>
+                                <w:lang w:bidi="ar-EG"/>
+                              </w:rPr>
+                              <w:t>نت</w:t>
+                            </w:r>
+                            <w:r>
+                              <w:rPr>
+                                <w:rFonts w:cs="Arial" w:hint="cs"/>
+                                <w:b/>
+                                <w:bCs/>
+                                <w:sz w:val="32"/>
+                                <w:szCs w:val="32"/>
+                                <w:rtl/>
+                                <w:lang w:bidi="ar-EG"/>
+                              </w:rPr>
+                              <w:t>ـ</w:t>
+                            </w:r>
+                            <w:r>
+                              <w:rPr>
+                                <w:rFonts w:cs="Arial" w:hint="cs"/>
+                                <w:b/>
+                                <w:bCs/>
+                                <w:sz w:val="32"/>
+                                <w:szCs w:val="32"/>
+                                <w:rtl/>
+                                <w:lang w:bidi="ar-EG"/>
+                              </w:rPr>
+                              <w:t>ظ</w:t>
+                            </w:r>
+                            <w:r>
+                              <w:rPr>
+                                <w:rFonts w:cs="Arial" w:hint="cs"/>
+                                <w:b/>
+                                <w:bCs/>
+                                <w:sz w:val="32"/>
+                                <w:szCs w:val="32"/>
+                                <w:rtl/>
+                                <w:lang w:bidi="ar-EG"/>
+                              </w:rPr>
+                              <w:t>ـ</w:t>
+                            </w:r>
+                            <w:r>
+                              <w:rPr>
+                                <w:rFonts w:cs="Arial" w:hint="cs"/>
+                                <w:b/>
+                                <w:bCs/>
+                                <w:sz w:val="32"/>
+                                <w:szCs w:val="32"/>
+                                <w:rtl/>
+                                <w:lang w:bidi="ar-EG"/>
+                              </w:rPr>
+                              <w:t>ار</w:t>
                             </w:r>
                           </w:p>
                         </w:txbxContent>
@@ -107,31 +227,151 @@
                 <v:stroke joinstyle="miter"/>
                 <v:path gradientshapeok="t" o:connecttype="rect"/>
               </v:shapetype>
-              <v:shape id="Text Box 2" o:spid="_x0000_s1026" type="#_x0000_t202" style="position:absolute;margin-left:22.2pt;margin-top:63.6pt;width:107.4pt;height:41.15pt;z-index:251667456;visibility:visible;mso-wrap-style:square;mso-width-percent:0;mso-height-percent:0;mso-wrap-distance-left:9pt;mso-wrap-distance-top:3.6pt;mso-wrap-distance-right:9pt;mso-wrap-distance-bottom:3.6pt;mso-position-horizontal:absolute;mso-position-horizontal-relative:margin;mso-position-vertical:absolute;mso-position-vertical-relative:text;mso-width-percent:0;mso-height-percent:0;mso-width-relative:margin;mso-height-relative:margin;v-text-anchor:middle" o:gfxdata="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" filled="f" stroked="f">
+              <v:shape id="Text Box 2" o:spid="_x0000_s1026" type="#_x0000_t202" style="position:absolute;margin-left:23.7pt;margin-top:59.2pt;width:107.4pt;height:23.6pt;z-index:251667456;visibility:visible;mso-wrap-style:square;mso-width-percent:0;mso-height-percent:0;mso-wrap-distance-left:9pt;mso-wrap-distance-top:3.6pt;mso-wrap-distance-right:9pt;mso-wrap-distance-bottom:3.6pt;mso-position-horizontal:absolute;mso-position-horizontal-relative:margin;mso-position-vertical:absolute;mso-position-vertical-relative:text;mso-width-percent:0;mso-height-percent:0;mso-width-relative:margin;mso-height-relative:margin;v-text-anchor:middle" o:gfxdata="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" filled="f" stroked="f">
                 <v:textbox>
                   <w:txbxContent>
                     <w:p>
                       <w:pPr>
-                        <w:jc w:val="right"/>
-                        <w:rPr>
-                          <w:b/>
-                          <w:bCs/>
-                          <w:sz w:val="40"/>
-                          <w:szCs w:val="40"/>
+                        <w:jc w:val="center"/>
+                        <w:rPr>
+                          <w:b/>
+                          <w:bCs/>
+                          <w:sz w:val="32"/>
+                          <w:szCs w:val="32"/>
                           <w:lang w:bidi="ar-EG"/>
                         </w:rPr>
                       </w:pPr>
                       <w:r>
                         <w:rPr>
-                          <w:rFonts w:hint="cs"/>
-                          <w:b/>
-                          <w:bCs/>
-                          <w:sz w:val="40"/>
-                          <w:szCs w:val="40"/>
-                          <w:rtl/>
-                          <w:lang w:bidi="ar-EG"/>
-                        </w:rPr>
-                        <w:t xml:space="preserve">رقم: </w:t>
+                          <w:rFonts w:cs="Arial" w:hint="cs"/>
+                          <w:b/>
+                          <w:bCs/>
+                          <w:sz w:val="32"/>
+                          <w:szCs w:val="32"/>
+                          <w:rtl/>
+                          <w:lang w:bidi="ar-EG"/>
+                        </w:rPr>
+                        <w:t>رق</w:t>
+                      </w:r>
+                      <w:r>
+                        <w:rPr>
+                          <w:rFonts w:cs="Arial" w:hint="cs"/>
+                          <w:b/>
+                          <w:bCs/>
+                          <w:sz w:val="32"/>
+                          <w:szCs w:val="32"/>
+                          <w:rtl/>
+                          <w:lang w:bidi="ar-EG"/>
+                        </w:rPr>
+                        <w:t>ـ</w:t>
+                      </w:r>
+                      <w:r>
+                        <w:rPr>
+                          <w:rFonts w:cs="Arial" w:hint="cs"/>
+                          <w:b/>
+                          <w:bCs/>
+                          <w:sz w:val="32"/>
+                          <w:szCs w:val="32"/>
+                          <w:rtl/>
+                          <w:lang w:bidi="ar-EG"/>
+                        </w:rPr>
+                        <w:t>م</w:t>
+                      </w:r>
+                      <w:r>
+                        <w:rPr>
+                          <w:rFonts w:cs="Arial"/>
+                          <w:b/>
+                          <w:bCs/>
+                          <w:sz w:val="32"/>
+                          <w:szCs w:val="32"/>
+                          <w:rtl/>
+                          <w:lang w:bidi="ar-EG"/>
+                        </w:rPr>
+                        <w:t xml:space="preserve"> </w:t>
+                      </w:r>
+                      <w:r>
+                        <w:rPr>
+                          <w:rFonts w:cs="Arial" w:hint="cs"/>
+                          <w:b/>
+                          <w:bCs/>
+                          <w:sz w:val="32"/>
+                          <w:szCs w:val="32"/>
+                          <w:rtl/>
+                          <w:lang w:bidi="ar-EG"/>
+                        </w:rPr>
+                        <w:t>ال</w:t>
+                      </w:r>
+                      <w:r>
+                        <w:rPr>
+                          <w:rFonts w:cs="Arial" w:hint="cs"/>
+                          <w:b/>
+                          <w:bCs/>
+                          <w:sz w:val="32"/>
+                          <w:szCs w:val="32"/>
+                          <w:rtl/>
+                          <w:lang w:bidi="ar-EG"/>
+                        </w:rPr>
+                        <w:t>ا</w:t>
+                      </w:r>
+                      <w:r>
+                        <w:rPr>
+                          <w:rFonts w:cs="Arial" w:hint="cs"/>
+                          <w:b/>
+                          <w:bCs/>
+                          <w:sz w:val="32"/>
+                          <w:szCs w:val="32"/>
+                          <w:rtl/>
+                          <w:lang w:bidi="ar-EG"/>
+                        </w:rPr>
+                        <w:t>نت</w:t>
+                      </w:r>
+                      <w:r>
+                        <w:rPr>
+                          <w:rFonts w:cs="Arial" w:hint="cs"/>
+                          <w:b/>
+                          <w:bCs/>
+                          <w:sz w:val="32"/>
+                          <w:szCs w:val="32"/>
+                          <w:rtl/>
+                          <w:lang w:bidi="ar-EG"/>
+                        </w:rPr>
+                        <w:t>ـ</w:t>
+                      </w:r>
+                      <w:r>
+                        <w:rPr>
+                          <w:rFonts w:cs="Arial" w:hint="cs"/>
+                          <w:b/>
+                          <w:bCs/>
+                          <w:sz w:val="32"/>
+                          <w:szCs w:val="32"/>
+                          <w:rtl/>
+                          <w:lang w:bidi="ar-EG"/>
+                        </w:rPr>
+                        <w:t>ظ</w:t>
+                      </w:r>
+                      <w:r>
+                        <w:rPr>
+                          <w:rFonts w:cs="Arial" w:hint="cs"/>
+                          <w:b/>
+                          <w:bCs/>
+                          <w:sz w:val="32"/>
+                          <w:szCs w:val="32"/>
+                          <w:rtl/>
+                          <w:lang w:bidi="ar-EG"/>
+                        </w:rPr>
+                        <w:t>ـ</w:t>
+                      </w:r>
+                      <w:r>
+                        <w:rPr>
+                          <w:rFonts w:cs="Arial" w:hint="cs"/>
+                          <w:b/>
+                          <w:bCs/>
+                          <w:sz w:val="32"/>
+                          <w:szCs w:val="32"/>
+                          <w:rtl/>
+                          <w:lang w:bidi="ar-EG"/>
+                        </w:rPr>
+                        <w:t>ار</w:t>
                       </w:r>
                     </w:p>
                   </w:txbxContent>
@@ -144,64 +384,182 @@
       </w:r>
       <w:r>
         <w:rPr>
-          <w:rFonts w:cs="GE Jarida Heavy"/>
           <w:noProof/>
         </w:rPr>
-        <w:drawing>
-          <wp:anchor distT="0" distB="0" distL="114300" distR="114300" simplePos="0" relativeHeight="251671552" behindDoc="1" locked="0" layoutInCell="1" allowOverlap="1" wp14:anchorId="5695CEC3" wp14:editId="736EC7CF">
-            <wp:simplePos x="0" y="0"/>
-            <wp:positionH relativeFrom="margin">
-              <wp:align>center</wp:align>
-            </wp:positionH>
-            <wp:positionV relativeFrom="paragraph">
-              <wp:posOffset>1315720</wp:posOffset>
-            </wp:positionV>
-            <wp:extent cx="1284605" cy="1284605"/>
-            <wp:effectExtent l="0" t="0" r="0" b="0"/>
-            <wp:wrapNone/>
-            <wp:docPr id="422006124" name="Picture 5"/>
-            <wp:cNvGraphicFramePr>
-              <a:graphicFrameLocks xmlns:a="http://schemas.openxmlformats.org/drawingml/2006/main" noChangeAspect="1"/>
-            </wp:cNvGraphicFramePr>
-            <a:graphic xmlns:a="http://schemas.openxmlformats.org/drawingml/2006/main">
-              <a:graphicData uri="http://schemas.openxmlformats.org/drawingml/2006/picture">
-                <pic:pic xmlns:pic="http://schemas.openxmlformats.org/drawingml/2006/picture">
-                  <pic:nvPicPr>
-                    <pic:cNvPr id="422006124" name="Picture 422006124"/>
-                    <pic:cNvPicPr/>
-                  </pic:nvPicPr>
-                  <pic:blipFill>
-                    <a:blip r:embed="rId5" cstate="print">
-                      <a:extLst>
-                        <a:ext uri="{28A0092B-C50C-407E-A947-70E740481C1C}">
-                          <a14:useLocalDpi xmlns:a14="http://schemas.microsoft.com/office/drawing/2010/main" val="0"/>
-                        </a:ext>
-                      </a:extLst>
-                    </a:blip>
-                    <a:stretch>
-                      <a:fillRect/>
-                    </a:stretch>
-                  </pic:blipFill>
-                  <pic:spPr>
-                    <a:xfrm>
-                      <a:off x="0" y="0"/>
-                      <a:ext cx="1284605" cy="1284605"/>
-                    </a:xfrm>
-                    <a:prstGeom prst="rect">
-                      <a:avLst/>
-                    </a:prstGeom>
-                  </pic:spPr>
-                </pic:pic>
-              </a:graphicData>
-            </a:graphic>
-            <wp14:sizeRelH relativeFrom="margin">
-              <wp14:pctWidth>0</wp14:pctWidth>
-            </wp14:sizeRelH>
-            <wp14:sizeRelV relativeFrom="margin">
-              <wp14:pctHeight>0</wp14:pctHeight>
-            </wp14:sizeRelV>
-          </wp:anchor>
-        </w:drawing>
+        <mc:AlternateContent>
+          <mc:Choice Requires="wps">
+            <w:drawing>
+              <wp:anchor distT="45720" distB="45720" distL="114300" distR="114300" simplePos="0" relativeHeight="251673600" behindDoc="0" locked="0" layoutInCell="1" allowOverlap="1" wp14:anchorId="2A3DD7F9" wp14:editId="59F8DF00">
+                <wp:simplePos x="0" y="0"/>
+                <wp:positionH relativeFrom="margin">
+                  <wp:posOffset>-215265</wp:posOffset>
+                </wp:positionH>
+                <wp:positionV relativeFrom="paragraph">
+                  <wp:posOffset>245110</wp:posOffset>
+                </wp:positionV>
+                <wp:extent cx="2395855" cy="552450"/>
+                <wp:effectExtent l="0" t="0" r="0" b="0"/>
+                <wp:wrapSquare wrapText="bothSides"/>
+                <wp:docPr id="1" name="Text Box 2"/>
+                <wp:cNvGraphicFramePr>
+                  <a:graphicFrameLocks xmlns:a="http://schemas.openxmlformats.org/drawingml/2006/main"/>
+                </wp:cNvGraphicFramePr>
+                <a:graphic xmlns:a="http://schemas.openxmlformats.org/drawingml/2006/main">
+                  <a:graphicData uri="http://schemas.microsoft.com/office/word/2010/wordprocessingShape">
+                    <wps:wsp>
+                      <wps:cNvSpPr txBox="1">
+                        <a:spLocks noChangeArrowheads="1"/>
+                      </wps:cNvSpPr>
+                      <wps:spPr bwMode="auto">
+                        <a:xfrm>
+                          <a:off x="0" y="0"/>
+                          <a:ext cx="2395855" cy="552450"/>
+                        </a:xfrm>
+                        <a:prstGeom prst="rect">
+                          <a:avLst/>
+                        </a:prstGeom>
+                        <a:noFill/>
+                        <a:ln>
+                          <a:noFill/>
+                        </a:ln>
+                      </wps:spPr>
+                      <wps:style>
+                        <a:lnRef idx="0">
+                          <a:scrgbClr r="0" g="0" b="0"/>
+                        </a:lnRef>
+                        <a:fillRef idx="0">
+                          <a:scrgbClr r="0" g="0" b="0"/>
+                        </a:fillRef>
+                        <a:effectRef idx="0">
+                          <a:scrgbClr r="0" g="0" b="0"/>
+                        </a:effectRef>
+                        <a:fontRef idx="minor">
+                          <a:schemeClr val="dk1"/>
+                        </a:fontRef>
+                      </wps:style>
+                      <wps:txbx>
+                        <w:txbxContent>
+                          <w:p>
+                            <w:pPr>
+                              <w:jc w:val="center"/>
+                              <w:rPr>
+                                <w:b/>
+                                <w:bCs/>
+                                <w:sz w:val="20"/>
+                                <w:szCs w:val="20"/>
+                                <w:lang w:bidi="ar-EG"/>
+                              </w:rPr>
+                            </w:pPr>
+                            <w:r>
+                              <w:rPr>
+                                <w:rFonts w:cs="Arial" w:hint="cs"/>
+                                <w:b/>
+                                <w:bCs/>
+                                <w:sz w:val="28"/>
+                                <w:szCs w:val="28"/>
+                                <w:rtl/>
+                                <w:lang w:bidi="ar-EG"/>
+                              </w:rPr>
+                              <w:t>جـامـعـة الـزقــازيـق الأهـلـيـة</w:t>
+                            </w:r>
+                            <w:r>
+                              <w:rPr>
+                                <w:rFonts w:cs="Arial"/>
+                                <w:b/>
+                                <w:bCs/>
+                                <w:sz w:val="28"/>
+                                <w:szCs w:val="28"/>
+                                <w:rtl/>
+                                <w:lang w:bidi="ar-EG"/>
+                              </w:rPr>
+                              <w:br/>
+                            </w:r>
+                            <w:r>
+                              <w:rPr>
+                                <w:rFonts w:cs="Arial" w:hint="cs"/>
+                                <w:b/>
+                                <w:bCs/>
+                                <w:rtl/>
+                                <w:lang w:bidi="ar-EG"/>
+                              </w:rPr>
+                              <w:t>كلــية الهــنـدسـة</w:t>
+                            </w:r>
+                          </w:p>
+                        </w:txbxContent>
+                      </wps:txbx>
+                      <wps:bodyPr rot="0" vert="horz" wrap="square" lIns="91440" tIns="45720" rIns="91440" bIns="45720" anchor="ctr" anchorCtr="0">
+                        <a:noAutofit/>
+                      </wps:bodyPr>
+                    </wps:wsp>
+                  </a:graphicData>
+                </a:graphic>
+                <wp14:sizeRelH relativeFrom="margin">
+                  <wp14:pctWidth>0</wp14:pctWidth>
+                </wp14:sizeRelH>
+                <wp14:sizeRelV relativeFrom="margin">
+                  <wp14:pctHeight>0</wp14:pctHeight>
+                </wp14:sizeRelV>
+              </wp:anchor>
+            </w:drawing>
+          </mc:Choice>
+          <mc:Fallback>
+            <w:pict>
+              <v:shape w14:anchorId="2A3DD7F9" id="_x0000_s1027" type="#_x0000_t202" style="position:absolute;margin-left:-16.95pt;margin-top:19.3pt;width:188.65pt;height:43.5pt;z-index:251673600;visibility:visible;mso-wrap-style:square;mso-width-percent:0;mso-height-percent:0;mso-wrap-distance-left:9pt;mso-wrap-distance-top:3.6pt;mso-wrap-distance-right:9pt;mso-wrap-distance-bottom:3.6pt;mso-position-horizontal:absolute;mso-position-horizontal-relative:margin;mso-position-vertical:absolute;mso-position-vertical-relative:text;mso-width-percent:0;mso-height-percent:0;mso-width-relative:margin;mso-height-relative:margin;v-text-anchor:middle" o:gfxdata="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" filled="f" stroked="f">
+                <v:textbox>
+                  <w:txbxContent>
+                    <w:p>
+                      <w:pPr>
+                        <w:jc w:val="center"/>
+                        <w:rPr>
+                          <w:b/>
+                          <w:bCs/>
+                          <w:sz w:val="20"/>
+                          <w:szCs w:val="20"/>
+                          <w:lang w:bidi="ar-EG"/>
+                        </w:rPr>
+                      </w:pPr>
+                      <w:r>
+                        <w:rPr>
+                          <w:rFonts w:cs="Arial" w:hint="cs"/>
+                          <w:b/>
+                          <w:bCs/>
+                          <w:sz w:val="28"/>
+                          <w:szCs w:val="28"/>
+                          <w:rtl/>
+                          <w:lang w:bidi="ar-EG"/>
+                        </w:rPr>
+                        <w:t>جـامـعـة الـزقــازيـق الأهـلـيـة</w:t>
+                      </w:r>
+                      <w:r>
+                        <w:rPr>
+                          <w:rFonts w:cs="Arial"/>
+                          <w:b/>
+                          <w:bCs/>
+                          <w:sz w:val="28"/>
+                          <w:szCs w:val="28"/>
+                          <w:rtl/>
+                          <w:lang w:bidi="ar-EG"/>
+                        </w:rPr>
+                        <w:br/>
+                      </w:r>
+                      <w:r>
+                        <w:rPr>
+                          <w:rFonts w:cs="Arial" w:hint="cs"/>
+                          <w:b/>
+                          <w:bCs/>
+                          <w:rtl/>
+                          <w:lang w:bidi="ar-EG"/>
+                        </w:rPr>
+                        <w:t>كلــية الهــنـدسـة</w:t>
+                      </w:r>
+                    </w:p>
+                  </w:txbxContent>
+                </v:textbox>
+                <w10:wrap type="square" anchorx="margin"/>
+              </v:shape>
+            </w:pict>
+          </mc:Fallback>
+        </mc:AlternateContent>
       </w:r>
       <w:r>
         <w:rPr>
@@ -210,7 +568,478 @@
         <mc:AlternateContent>
           <mc:Choice Requires="wps">
             <w:drawing>
-              <wp:inline distT="0" distB="0" distL="0" distR="0" wp14:anchorId="032CEAE0" wp14:editId="6DDEAA8B">
+              <wp:anchor distT="0" distB="0" distL="114300" distR="114300" simplePos="0" relativeHeight="251679744" behindDoc="0" locked="0" layoutInCell="1" allowOverlap="1" wp14:anchorId="33858092" wp14:editId="57612211">
+                <wp:simplePos x="0" y="0"/>
+                <wp:positionH relativeFrom="column">
+                  <wp:posOffset>-457200</wp:posOffset>
+                </wp:positionH>
+                <wp:positionV relativeFrom="paragraph">
+                  <wp:posOffset>2108697</wp:posOffset>
+                </wp:positionV>
+                <wp:extent cx="2882265" cy="0"/>
+                <wp:effectExtent l="0" t="0" r="0" b="0"/>
+                <wp:wrapNone/>
+                <wp:docPr id="3" name="Straight Connector 3"/>
+                <wp:cNvGraphicFramePr/>
+                <a:graphic xmlns:a="http://schemas.openxmlformats.org/drawingml/2006/main">
+                  <a:graphicData uri="http://schemas.microsoft.com/office/word/2010/wordprocessingShape">
+                    <wps:wsp>
+                      <wps:cNvCnPr/>
+                      <wps:spPr>
+                        <a:xfrm>
+                          <a:off x="0" y="0"/>
+                          <a:ext cx="2882265" cy="0"/>
+                        </a:xfrm>
+                        <a:prstGeom prst="line">
+                          <a:avLst/>
+                        </a:prstGeom>
+                        <a:ln w="9525"/>
+                      </wps:spPr>
+                      <wps:style>
+                        <a:lnRef idx="2">
+                          <a:schemeClr val="dk1"/>
+                        </a:lnRef>
+                        <a:fillRef idx="0">
+                          <a:schemeClr val="dk1"/>
+                        </a:fillRef>
+                        <a:effectRef idx="1">
+                          <a:schemeClr val="dk1"/>
+                        </a:effectRef>
+                        <a:fontRef idx="minor">
+                          <a:schemeClr val="tx1"/>
+                        </a:fontRef>
+                      </wps:style>
+                      <wps:bodyPr/>
+                    </wps:wsp>
+                  </a:graphicData>
+                </a:graphic>
+              </wp:anchor>
+            </w:drawing>
+          </mc:Choice>
+          <mc:Fallback>
+            <w:pict>
+              <v:line w14:anchorId="5D20C583" id="Straight Connector 3" o:spid="_x0000_s1026" style="position:absolute;left:0;text-align:left;z-index:251679744;visibility:visible;mso-wrap-style:square;mso-wrap-distance-left:9pt;mso-wrap-distance-top:0;mso-wrap-distance-right:9pt;mso-wrap-distance-bottom:0;mso-position-horizontal:absolute;mso-position-horizontal-relative:text;mso-position-vertical:absolute;mso-position-vertical-relative:text" from="-36pt,166.05pt" to="190.95pt,166.05pt" o:gfxdata="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" strokecolor="black [3200]">
+                <v:stroke joinstyle="miter"/>
+              </v:line>
+            </w:pict>
+          </mc:Fallback>
+        </mc:AlternateContent>
+      </w:r>
+      <w:r>
+        <w:rPr>
+          <w:noProof/>
+        </w:rPr>
+        <mc:AlternateContent>
+          <mc:Choice Requires="wps">
+            <w:drawing>
+              <wp:anchor distT="45720" distB="45720" distL="114300" distR="114300" simplePos="0" relativeHeight="251675648" behindDoc="0" locked="0" layoutInCell="1" allowOverlap="1" wp14:anchorId="52ECDBA1" wp14:editId="4E944010">
+                <wp:simplePos x="0" y="0"/>
+                <wp:positionH relativeFrom="margin">
+                  <wp:align>center</wp:align>
+                </wp:positionH>
+                <wp:positionV relativeFrom="paragraph">
+                  <wp:posOffset>1882775</wp:posOffset>
+                </wp:positionV>
+                <wp:extent cx="2395855" cy="236220"/>
+                <wp:effectExtent l="0" t="0" r="0" b="0"/>
+                <wp:wrapSquare wrapText="bothSides"/>
+                <wp:docPr id="2" name="Text Box 2"/>
+                <wp:cNvGraphicFramePr>
+                  <a:graphicFrameLocks xmlns:a="http://schemas.openxmlformats.org/drawingml/2006/main"/>
+                </wp:cNvGraphicFramePr>
+                <a:graphic xmlns:a="http://schemas.openxmlformats.org/drawingml/2006/main">
+                  <a:graphicData uri="http://schemas.microsoft.com/office/word/2010/wordprocessingShape">
+                    <wps:wsp>
+                      <wps:cNvSpPr txBox="1">
+                        <a:spLocks noChangeArrowheads="1"/>
+                      </wps:cNvSpPr>
+                      <wps:spPr bwMode="auto">
+                        <a:xfrm>
+                          <a:off x="0" y="0"/>
+                          <a:ext cx="2395855" cy="236220"/>
+                        </a:xfrm>
+                        <a:prstGeom prst="rect">
+                          <a:avLst/>
+                        </a:prstGeom>
+                        <a:noFill/>
+                        <a:ln>
+                          <a:noFill/>
+                        </a:ln>
+                      </wps:spPr>
+                      <wps:style>
+                        <a:lnRef idx="0">
+                          <a:scrgbClr r="0" g="0" b="0"/>
+                        </a:lnRef>
+                        <a:fillRef idx="0">
+                          <a:scrgbClr r="0" g="0" b="0"/>
+                        </a:fillRef>
+                        <a:effectRef idx="0">
+                          <a:scrgbClr r="0" g="0" b="0"/>
+                        </a:effectRef>
+                        <a:fontRef idx="minor">
+                          <a:schemeClr val="dk1"/>
+                        </a:fontRef>
+                      </wps:style>
+                      <wps:txbx>
+                        <w:txbxContent>
+                          <w:p>
+                            <w:pPr>
+                              <w:jc w:val="center"/>
+                              <w:rPr>
+                                <w:sz w:val="12"/>
+                                <w:szCs w:val="12"/>
+                                <w:lang w:bidi="ar-EG"/>
+                              </w:rPr>
+                            </w:pPr>
+                            <w:r>
+                              <w:rPr>
+                                <w:rFonts w:cs="Arial" w:hint="cs"/>
+                                <w:sz w:val="18"/>
+                                <w:szCs w:val="18"/>
+                                <w:rtl/>
+                                <w:lang w:bidi="ar-EG"/>
+                              </w:rPr>
+                              <w:t>يُرجى</w:t>
+                            </w:r>
+                            <w:r>
+                              <w:rPr>
+                                <w:rFonts w:cs="Arial"/>
+                                <w:sz w:val="18"/>
+                                <w:szCs w:val="18"/>
+                                <w:rtl/>
+                                <w:lang w:bidi="ar-EG"/>
+                              </w:rPr>
+                              <w:t xml:space="preserve"> </w:t>
+                            </w:r>
+                            <w:r>
+                              <w:rPr>
+                                <w:rFonts w:cs="Arial" w:hint="cs"/>
+                                <w:sz w:val="18"/>
+                                <w:szCs w:val="18"/>
+                                <w:rtl/>
+                                <w:lang w:bidi="ar-EG"/>
+                              </w:rPr>
+                              <w:t>الالتزام</w:t>
+                            </w:r>
+                            <w:r>
+                              <w:rPr>
+                                <w:rFonts w:cs="Arial"/>
+                                <w:sz w:val="18"/>
+                                <w:szCs w:val="18"/>
+                                <w:rtl/>
+                                <w:lang w:bidi="ar-EG"/>
+                              </w:rPr>
+                              <w:t xml:space="preserve"> </w:t>
+                            </w:r>
+                            <w:r>
+                              <w:rPr>
+                                <w:rFonts w:cs="Arial" w:hint="cs"/>
+                                <w:sz w:val="18"/>
+                                <w:szCs w:val="18"/>
+                                <w:rtl/>
+                                <w:lang w:bidi="ar-EG"/>
+                              </w:rPr>
+                              <w:t>والاحتفاظ</w:t>
+                            </w:r>
+                            <w:r>
+                              <w:rPr>
+                                <w:rFonts w:cs="Arial"/>
+                                <w:sz w:val="18"/>
+                                <w:szCs w:val="18"/>
+                                <w:rtl/>
+                                <w:lang w:bidi="ar-EG"/>
+                              </w:rPr>
+                              <w:t xml:space="preserve"> </w:t>
+                            </w:r>
+                            <w:r>
+                              <w:rPr>
+                                <w:rFonts w:cs="Arial" w:hint="cs"/>
+                                <w:sz w:val="18"/>
+                                <w:szCs w:val="18"/>
+                                <w:rtl/>
+                                <w:lang w:bidi="ar-EG"/>
+                              </w:rPr>
+                              <w:t>بالرقم</w:t>
+                            </w:r>
+                            <w:r>
+                              <w:rPr>
+                                <w:rFonts w:cs="Arial"/>
+                                <w:sz w:val="18"/>
+                                <w:szCs w:val="18"/>
+                                <w:rtl/>
+                                <w:lang w:bidi="ar-EG"/>
+                              </w:rPr>
+                              <w:t xml:space="preserve"> </w:t>
+                            </w:r>
+                            <w:r>
+                              <w:rPr>
+                                <w:rFonts w:cs="Arial" w:hint="cs"/>
+                                <w:sz w:val="18"/>
+                                <w:szCs w:val="18"/>
+                                <w:rtl/>
+                                <w:lang w:bidi="ar-EG"/>
+                              </w:rPr>
+                              <w:t>سيتم</w:t>
+                            </w:r>
+                            <w:r>
+                              <w:rPr>
+                                <w:rFonts w:cs="Arial"/>
+                                <w:sz w:val="18"/>
+                                <w:szCs w:val="18"/>
+                                <w:rtl/>
+                                <w:lang w:bidi="ar-EG"/>
+                              </w:rPr>
+                              <w:t xml:space="preserve"> </w:t>
+                            </w:r>
+                            <w:r>
+                              <w:rPr>
+                                <w:rFonts w:cs="Arial" w:hint="cs"/>
+                                <w:sz w:val="18"/>
+                                <w:szCs w:val="18"/>
+                                <w:rtl/>
+                                <w:lang w:bidi="ar-EG"/>
+                              </w:rPr>
+                              <w:t>النداء</w:t>
+                            </w:r>
+                            <w:r>
+                              <w:rPr>
+                                <w:rFonts w:cs="Arial"/>
+                                <w:sz w:val="18"/>
+                                <w:szCs w:val="18"/>
+                                <w:rtl/>
+                                <w:lang w:bidi="ar-EG"/>
+                              </w:rPr>
+                              <w:t xml:space="preserve"> </w:t>
+                            </w:r>
+                            <w:r>
+                              <w:rPr>
+                                <w:rFonts w:cs="Arial" w:hint="cs"/>
+                                <w:sz w:val="18"/>
+                                <w:szCs w:val="18"/>
+                                <w:rtl/>
+                                <w:lang w:bidi="ar-EG"/>
+                              </w:rPr>
+                              <w:t>حسب</w:t>
+                            </w:r>
+                            <w:r>
+                              <w:rPr>
+                                <w:rFonts w:cs="Arial"/>
+                                <w:sz w:val="18"/>
+                                <w:szCs w:val="18"/>
+                                <w:rtl/>
+                                <w:lang w:bidi="ar-EG"/>
+                              </w:rPr>
+                              <w:t xml:space="preserve"> </w:t>
+                            </w:r>
+                            <w:r>
+                              <w:rPr>
+                                <w:rFonts w:cs="Arial" w:hint="cs"/>
+                                <w:sz w:val="18"/>
+                                <w:szCs w:val="18"/>
+                                <w:rtl/>
+                                <w:lang w:bidi="ar-EG"/>
+                              </w:rPr>
+                              <w:t>الترتيب</w:t>
+                            </w:r>
+                          </w:p>
+                        </w:txbxContent>
+                      </wps:txbx>
+                      <wps:bodyPr rot="0" vert="horz" wrap="square" lIns="91440" tIns="45720" rIns="91440" bIns="45720" anchor="ctr" anchorCtr="0">
+                        <a:noAutofit/>
+                      </wps:bodyPr>
+                    </wps:wsp>
+                  </a:graphicData>
+                </a:graphic>
+                <wp14:sizeRelH relativeFrom="margin">
+                  <wp14:pctWidth>0</wp14:pctWidth>
+                </wp14:sizeRelH>
+                <wp14:sizeRelV relativeFrom="margin">
+                  <wp14:pctHeight>0</wp14:pctHeight>
+                </wp14:sizeRelV>
+              </wp:anchor>
+            </w:drawing>
+          </mc:Choice>
+          <mc:Fallback>
+            <w:pict>
+              <v:shape w14:anchorId="52ECDBA1" id="_x0000_s1028" type="#_x0000_t202" style="position:absolute;margin-left:0;margin-top:148.25pt;width:188.65pt;height:18.6pt;z-index:251675648;visibility:visible;mso-wrap-style:square;mso-width-percent:0;mso-height-percent:0;mso-wrap-distance-left:9pt;mso-wrap-distance-top:3.6pt;mso-wrap-distance-right:9pt;mso-wrap-distance-bottom:3.6pt;mso-position-horizontal:center;mso-position-horizontal-relative:margin;mso-position-vertical:absolute;mso-position-vertical-relative:text;mso-width-percent:0;mso-height-percent:0;mso-width-relative:margin;mso-height-relative:margin;v-text-anchor:middle" o:gfxdata="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" filled="f" stroked="f">
+                <v:textbox>
+                  <w:txbxContent>
+                    <w:p>
+                      <w:pPr>
+                        <w:jc w:val="center"/>
+                        <w:rPr>
+                          <w:sz w:val="12"/>
+                          <w:szCs w:val="12"/>
+                          <w:lang w:bidi="ar-EG"/>
+                        </w:rPr>
+                      </w:pPr>
+                      <w:r>
+                        <w:rPr>
+                          <w:rFonts w:cs="Arial" w:hint="cs"/>
+                          <w:sz w:val="18"/>
+                          <w:szCs w:val="18"/>
+                          <w:rtl/>
+                          <w:lang w:bidi="ar-EG"/>
+                        </w:rPr>
+                        <w:t>يُرجى</w:t>
+                      </w:r>
+                      <w:r>
+                        <w:rPr>
+                          <w:rFonts w:cs="Arial"/>
+                          <w:sz w:val="18"/>
+                          <w:szCs w:val="18"/>
+                          <w:rtl/>
+                          <w:lang w:bidi="ar-EG"/>
+                        </w:rPr>
+                        <w:t xml:space="preserve"> </w:t>
+                      </w:r>
+                      <w:r>
+                        <w:rPr>
+                          <w:rFonts w:cs="Arial" w:hint="cs"/>
+                          <w:sz w:val="18"/>
+                          <w:szCs w:val="18"/>
+                          <w:rtl/>
+                          <w:lang w:bidi="ar-EG"/>
+                        </w:rPr>
+                        <w:t>الالتزام</w:t>
+                      </w:r>
+                      <w:r>
+                        <w:rPr>
+                          <w:rFonts w:cs="Arial"/>
+                          <w:sz w:val="18"/>
+                          <w:szCs w:val="18"/>
+                          <w:rtl/>
+                          <w:lang w:bidi="ar-EG"/>
+                        </w:rPr>
+                        <w:t xml:space="preserve"> </w:t>
+                      </w:r>
+                      <w:r>
+                        <w:rPr>
+                          <w:rFonts w:cs="Arial" w:hint="cs"/>
+                          <w:sz w:val="18"/>
+                          <w:szCs w:val="18"/>
+                          <w:rtl/>
+                          <w:lang w:bidi="ar-EG"/>
+                        </w:rPr>
+                        <w:t>والاحتفاظ</w:t>
+                      </w:r>
+                      <w:r>
+                        <w:rPr>
+                          <w:rFonts w:cs="Arial"/>
+                          <w:sz w:val="18"/>
+                          <w:szCs w:val="18"/>
+                          <w:rtl/>
+                          <w:lang w:bidi="ar-EG"/>
+                        </w:rPr>
+                        <w:t xml:space="preserve"> </w:t>
+                      </w:r>
+                      <w:r>
+                        <w:rPr>
+                          <w:rFonts w:cs="Arial" w:hint="cs"/>
+                          <w:sz w:val="18"/>
+                          <w:szCs w:val="18"/>
+                          <w:rtl/>
+                          <w:lang w:bidi="ar-EG"/>
+                        </w:rPr>
+                        <w:t>بالرقم</w:t>
+                      </w:r>
+                      <w:r>
+                        <w:rPr>
+                          <w:rFonts w:cs="Arial"/>
+                          <w:sz w:val="18"/>
+                          <w:szCs w:val="18"/>
+                          <w:rtl/>
+                          <w:lang w:bidi="ar-EG"/>
+                        </w:rPr>
+                        <w:t xml:space="preserve"> </w:t>
+                      </w:r>
+                      <w:r>
+                        <w:rPr>
+                          <w:rFonts w:cs="Arial" w:hint="cs"/>
+                          <w:sz w:val="18"/>
+                          <w:szCs w:val="18"/>
+                          <w:rtl/>
+                          <w:lang w:bidi="ar-EG"/>
+                        </w:rPr>
+                        <w:t>سيتم</w:t>
+                      </w:r>
+                      <w:r>
+                        <w:rPr>
+                          <w:rFonts w:cs="Arial"/>
+                          <w:sz w:val="18"/>
+                          <w:szCs w:val="18"/>
+                          <w:rtl/>
+                          <w:lang w:bidi="ar-EG"/>
+                        </w:rPr>
+                        <w:t xml:space="preserve"> </w:t>
+                      </w:r>
+                      <w:r>
+                        <w:rPr>
+                          <w:rFonts w:cs="Arial" w:hint="cs"/>
+                          <w:sz w:val="18"/>
+                          <w:szCs w:val="18"/>
+                          <w:rtl/>
+                          <w:lang w:bidi="ar-EG"/>
+                        </w:rPr>
+                        <w:t>النداء</w:t>
+                      </w:r>
+                      <w:r>
+                        <w:rPr>
+                          <w:rFonts w:cs="Arial"/>
+                          <w:sz w:val="18"/>
+                          <w:szCs w:val="18"/>
+                          <w:rtl/>
+                          <w:lang w:bidi="ar-EG"/>
+                        </w:rPr>
+                        <w:t xml:space="preserve"> </w:t>
+                      </w:r>
+                      <w:r>
+                        <w:rPr>
+                          <w:rFonts w:cs="Arial" w:hint="cs"/>
+                          <w:sz w:val="18"/>
+                          <w:szCs w:val="18"/>
+                          <w:rtl/>
+                          <w:lang w:bidi="ar-EG"/>
+                        </w:rPr>
+                        <w:t>حسب</w:t>
+                      </w:r>
+                      <w:r>
+                        <w:rPr>
+                          <w:rFonts w:cs="Arial"/>
+                          <w:sz w:val="18"/>
+                          <w:szCs w:val="18"/>
+                          <w:rtl/>
+                          <w:lang w:bidi="ar-EG"/>
+                        </w:rPr>
+                        <w:t xml:space="preserve"> </w:t>
+                      </w:r>
+                      <w:r>
+                        <w:rPr>
+                          <w:rFonts w:cs="Arial" w:hint="cs"/>
+                          <w:sz w:val="18"/>
+                          <w:szCs w:val="18"/>
+                          <w:rtl/>
+                          <w:lang w:bidi="ar-EG"/>
+                        </w:rPr>
+                        <w:t>الترتيب</w:t>
+                      </w:r>
+                    </w:p>
+                  </w:txbxContent>
+                </v:textbox>
+                <w10:wrap type="square" anchorx="margin"/>
+              </v:shape>
+            </w:pict>
+          </mc:Fallback>
+        </mc:AlternateContent>
+      </w:r>
+      <w:r>
+        <w:rPr>
+          <w:noProof/>
+        </w:rPr>
+        <mc:AlternateContent>
+          <mc:Choice Requires="wps">
+            <w:drawing>
+              <wp:inline distT="0" distB="0" distL="0" distR="0" wp14:anchorId="032CEAE0" wp14:editId="573F6625">
                 <wp:extent cx="304800" cy="304800"/>
                 <wp:effectExtent l="0" t="0" r="0" b="0"/>
                 <wp:docPr id="1912854293" name="Rectangle 2"/>
@@ -266,8 +1095,9 @@
           </mc:Choice>
           <mc:Fallback>
             <w:pict>
-              <v:rect w14:anchorId="20AB2A06" id="Rectangle 2" o:spid="_x0000_s1026" style="width:24pt;height:24pt;visibility:visible;mso-wrap-style:square;mso-left-percent:-10001;mso-top-percent:-10001;mso-position-horizontal:absolute;mso-position-horizontal-relative:char;mso-position-vertical:absolute;mso-position-vertical-relative:line;mso-left-percent:-10001;mso-top-percent:-10001;v-text-anchor:top" o:gfxdata="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" filled="f" stroked="f">
+              <v:rect w14:anchorId="0824D1D3" id="Rectangle 2" o:spid="_x0000_s1026" style="width:24pt;height:24pt;visibility:visible;mso-wrap-style:square;mso-left-percent:-10001;mso-top-percent:-10001;mso-position-horizontal:absolute;mso-position-horizontal-relative:char;mso-position-vertical:absolute;mso-position-vertical-relative:line;mso-left-percent:-10001;mso-top-percent:-10001;v-text-anchor:top" o:gfxdata="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" filled="f" stroked="f">
                 <o:lock v:ext="edit" aspectratio="t"/>
+                <w10:wrap anchorx="page"/>
                 <w10:anchorlock/>
               </v:rect>
             </w:pict>
@@ -303,11 +1133,11 @@
                     <pic:cNvPicPr/>
                   </pic:nvPicPr>
                   <pic:blipFill rotWithShape="1">
-                    <a:blip r:embed="rId6">
+                    <a:blip r:embed="rId5">
                       <a:extLst>
                         <a:ext uri="{BEBA8EAE-BF5A-486C-A8C5-ECC9F3942E4B}">
                           <a14:imgProps xmlns:a14="http://schemas.microsoft.com/office/drawing/2010/main">
-                            <a14:imgLayer r:embed="rId7">
+                            <a14:imgLayer r:embed="rId6">
                               <a14:imgEffect>
                                 <a14:sharpenSoften amount="25000"/>
                               </a14:imgEffect>
@@ -358,7 +1188,7 @@
           <w:szCs w:val="28"/>
         </w:rPr>
         <w:drawing>
-          <wp:anchor distT="0" distB="0" distL="114300" distR="114300" simplePos="0" relativeHeight="251659264" behindDoc="1" locked="0" layoutInCell="1" allowOverlap="1" wp14:anchorId="48BE1D37" wp14:editId="77544EB9">
+          <wp:anchor distT="0" distB="0" distL="114300" distR="114300" simplePos="0" relativeHeight="251659264" behindDoc="1" locked="0" layoutInCell="1" allowOverlap="1" wp14:anchorId="48BE1D37" wp14:editId="3423F115">
             <wp:simplePos x="0" y="0"/>
             <wp:positionH relativeFrom="margin">
               <wp:posOffset>1391920</wp:posOffset>
@@ -383,7 +1213,7 @@
                     </pic:cNvPicPr>
                   </pic:nvPicPr>
                   <pic:blipFill>
-                    <a:blip r:embed="rId8" cstate="print">
+                    <a:blip r:embed="rId7" cstate="print">
                       <a:extLst>
                         <a:ext uri="{28A0092B-C50C-407E-A947-70E740481C1C}">
                           <a14:useLocalDpi xmlns:a14="http://schemas.microsoft.com/office/drawing/2010/main" val="0"/>
@@ -420,6 +1250,13 @@
           </wp:anchor>
         </w:drawing>
       </w:r>
+    </w:p>
+    <w:p>
+      <w:pPr>
+        <w:rPr>
+          <w:rtl/>
+        </w:rPr>
+      </w:pPr>
       <w:r>
         <w:rPr>
           <w:noProof/>
@@ -427,18 +1264,18 @@
         <mc:AlternateContent>
           <mc:Choice Requires="wps">
             <w:drawing>
-              <wp:anchor distT="45720" distB="45720" distL="114300" distR="114300" simplePos="0" relativeHeight="251665408" behindDoc="0" locked="0" layoutInCell="1" allowOverlap="1" wp14:anchorId="4A628CF9" wp14:editId="68AB37FF">
+              <wp:anchor distT="45720" distB="45720" distL="114300" distR="114300" simplePos="0" relativeHeight="251685888" behindDoc="0" locked="0" layoutInCell="1" allowOverlap="1" wp14:anchorId="2EFE6191" wp14:editId="0FE6304A">
                 <wp:simplePos x="0" y="0"/>
                 <wp:positionH relativeFrom="margin">
-                  <wp:align>right</wp:align>
+                  <wp:align>center</wp:align>
                 </wp:positionH>
                 <wp:positionV relativeFrom="paragraph">
-                  <wp:posOffset>361950</wp:posOffset>
+                  <wp:posOffset>1405812</wp:posOffset>
                 </wp:positionV>
-                <wp:extent cx="1943100" cy="581025"/>
-                <wp:effectExtent l="0" t="0" r="0" b="9525"/>
+                <wp:extent cx="2471420" cy="217805"/>
+                <wp:effectExtent l="0" t="0" r="0" b="0"/>
                 <wp:wrapSquare wrapText="bothSides"/>
-                <wp:docPr id="217" name="Text Box 2"/>
+                <wp:docPr id="11" name="Text Box 11"/>
                 <wp:cNvGraphicFramePr>
                   <a:graphicFrameLocks xmlns:a="http://schemas.openxmlformats.org/drawingml/2006/main"/>
                 </wp:cNvGraphicFramePr>
@@ -451,7 +1288,7 @@
                       <wps:spPr bwMode="auto">
                         <a:xfrm>
                           <a:off x="0" y="0"/>
-                          <a:ext cx="1943100" cy="581025"/>
+                          <a:ext cx="2471420" cy="217805"/>
                         </a:xfrm>
                         <a:prstGeom prst="rect">
                           <a:avLst/>
@@ -481,25 +1318,301 @@
                             <w:pPr>
                               <w:jc w:val="center"/>
                               <w:rPr>
-                                <w:b/>
-                                <w:bCs/>
-                                <w:sz w:val="40"/>
-                                <w:szCs w:val="40"/>
+                                <w:rFonts w:cs="Arial"/>
+                                <w:b/>
+                                <w:bCs/>
+                                <w:sz w:val="18"/>
+                                <w:szCs w:val="18"/>
                                 <w:lang w:bidi="ar-EG"/>
                               </w:rPr>
                             </w:pPr>
                             <w:r>
                               <w:rPr>
-                                <w:rFonts w:hint="cs"/>
-                                <w:b/>
-                                <w:bCs/>
-                                <w:sz w:val="40"/>
-                                <w:szCs w:val="40"/>
-                                <w:rtl/>
-                                <w:lang w:bidi="ar-EG"/>
-                              </w:rPr>
-                              <w:t>تقديم طالب جديد</w:t>
-                            </w:r>
+                                <w:rFonts w:cs="Arial"/>
+                                <w:b/>
+                                <w:bCs/>
+                                <w:sz w:val="18"/>
+                                <w:szCs w:val="18"/>
+                                <w:rtl/>
+                                <w:lang w:bidi="ar-EG"/>
+                              </w:rPr>
+                              <w:t>اتح</w:t>
+                            </w:r>
+                            <w:r>
+                              <w:rPr>
+                                <w:rFonts w:cs="Arial" w:hint="cs"/>
+                                <w:b/>
+                                <w:bCs/>
+                                <w:sz w:val="18"/>
+                                <w:szCs w:val="18"/>
+                                <w:rtl/>
+                                <w:lang w:bidi="ar-EG"/>
+                              </w:rPr>
+                              <w:t>ـ</w:t>
+                            </w:r>
+                            <w:r>
+                              <w:rPr>
+                                <w:rFonts w:cs="Arial"/>
+                                <w:b/>
+                                <w:bCs/>
+                                <w:sz w:val="18"/>
+                                <w:szCs w:val="18"/>
+                                <w:rtl/>
+                                <w:lang w:bidi="ar-EG"/>
+                              </w:rPr>
+                              <w:t>اد ط</w:t>
+                            </w:r>
+                            <w:r>
+                              <w:rPr>
+                                <w:rFonts w:cs="Arial" w:hint="cs"/>
+                                <w:b/>
+                                <w:bCs/>
+                                <w:sz w:val="18"/>
+                                <w:szCs w:val="18"/>
+                                <w:rtl/>
+                                <w:lang w:bidi="ar-EG"/>
+                              </w:rPr>
+                              <w:t>ـ</w:t>
+                            </w:r>
+                            <w:r>
+                              <w:rPr>
+                                <w:rFonts w:cs="Arial"/>
+                                <w:b/>
+                                <w:bCs/>
+                                <w:sz w:val="18"/>
+                                <w:szCs w:val="18"/>
+                                <w:rtl/>
+                                <w:lang w:bidi="ar-EG"/>
+                              </w:rPr>
+                              <w:t>لاب كل</w:t>
+                            </w:r>
+                            <w:r>
+                              <w:rPr>
+                                <w:rFonts w:cs="Arial" w:hint="cs"/>
+                                <w:b/>
+                                <w:bCs/>
+                                <w:sz w:val="18"/>
+                                <w:szCs w:val="18"/>
+                                <w:rtl/>
+                                <w:lang w:bidi="ar-EG"/>
+                              </w:rPr>
+                              <w:t>ـ</w:t>
+                            </w:r>
+                            <w:r>
+                              <w:rPr>
+                                <w:rFonts w:cs="Arial"/>
+                                <w:b/>
+                                <w:bCs/>
+                                <w:sz w:val="18"/>
+                                <w:szCs w:val="18"/>
+                                <w:rtl/>
+                                <w:lang w:bidi="ar-EG"/>
+                              </w:rPr>
+                              <w:t>ية اله</w:t>
+                            </w:r>
+                            <w:r>
+                              <w:rPr>
+                                <w:rFonts w:cs="Arial" w:hint="cs"/>
+                                <w:b/>
+                                <w:bCs/>
+                                <w:sz w:val="18"/>
+                                <w:szCs w:val="18"/>
+                                <w:rtl/>
+                                <w:lang w:bidi="ar-EG"/>
+                              </w:rPr>
+                              <w:t>ـ</w:t>
+                            </w:r>
+                            <w:r>
+                              <w:rPr>
+                                <w:rFonts w:cs="Arial"/>
+                                <w:b/>
+                                <w:bCs/>
+                                <w:sz w:val="18"/>
+                                <w:szCs w:val="18"/>
+                                <w:rtl/>
+                                <w:lang w:bidi="ar-EG"/>
+                              </w:rPr>
+                              <w:t>ندس</w:t>
+                            </w:r>
+                            <w:r>
+                              <w:rPr>
+                                <w:rFonts w:cs="Arial" w:hint="cs"/>
+                                <w:b/>
+                                <w:bCs/>
+                                <w:sz w:val="18"/>
+                                <w:szCs w:val="18"/>
+                                <w:rtl/>
+                                <w:lang w:bidi="ar-EG"/>
+                              </w:rPr>
+                              <w:t>ـ</w:t>
+                            </w:r>
+                            <w:r>
+                              <w:rPr>
+                                <w:rFonts w:cs="Arial"/>
+                                <w:b/>
+                                <w:bCs/>
+                                <w:sz w:val="18"/>
+                                <w:szCs w:val="18"/>
+                                <w:rtl/>
+                                <w:lang w:bidi="ar-EG"/>
+                              </w:rPr>
+                              <w:t>ة – ج</w:t>
+                            </w:r>
+                            <w:r>
+                              <w:rPr>
+                                <w:rFonts w:cs="Arial" w:hint="cs"/>
+                                <w:b/>
+                                <w:bCs/>
+                                <w:sz w:val="18"/>
+                                <w:szCs w:val="18"/>
+                                <w:rtl/>
+                                <w:lang w:bidi="ar-EG"/>
+                              </w:rPr>
+                              <w:t>ـ</w:t>
+                            </w:r>
+                            <w:r>
+                              <w:rPr>
+                                <w:rFonts w:cs="Arial"/>
+                                <w:b/>
+                                <w:bCs/>
+                                <w:sz w:val="18"/>
+                                <w:szCs w:val="18"/>
+                                <w:rtl/>
+                                <w:lang w:bidi="ar-EG"/>
+                              </w:rPr>
+                              <w:t>ام</w:t>
+                            </w:r>
+                            <w:r>
+                              <w:rPr>
+                                <w:rFonts w:cs="Arial" w:hint="cs"/>
+                                <w:b/>
+                                <w:bCs/>
+                                <w:sz w:val="18"/>
+                                <w:szCs w:val="18"/>
+                                <w:rtl/>
+                                <w:lang w:bidi="ar-EG"/>
+                              </w:rPr>
+                              <w:t>ـ</w:t>
+                            </w:r>
+                            <w:r>
+                              <w:rPr>
+                                <w:rFonts w:cs="Arial"/>
+                                <w:b/>
+                                <w:bCs/>
+                                <w:sz w:val="18"/>
+                                <w:szCs w:val="18"/>
+                                <w:rtl/>
+                                <w:lang w:bidi="ar-EG"/>
+                              </w:rPr>
+                              <w:t>عة الزق</w:t>
+                            </w:r>
+                            <w:r>
+                              <w:rPr>
+                                <w:rFonts w:cs="Arial" w:hint="cs"/>
+                                <w:b/>
+                                <w:bCs/>
+                                <w:sz w:val="18"/>
+                                <w:szCs w:val="18"/>
+                                <w:rtl/>
+                                <w:lang w:bidi="ar-EG"/>
+                              </w:rPr>
+                              <w:t>ـ</w:t>
+                            </w:r>
+                            <w:r>
+                              <w:rPr>
+                                <w:rFonts w:cs="Arial"/>
+                                <w:b/>
+                                <w:bCs/>
+                                <w:sz w:val="18"/>
+                                <w:szCs w:val="18"/>
+                                <w:rtl/>
+                                <w:lang w:bidi="ar-EG"/>
+                              </w:rPr>
+                              <w:t>ازيق الأه</w:t>
+                            </w:r>
+                            <w:r>
+                              <w:rPr>
+                                <w:rFonts w:cs="Arial" w:hint="cs"/>
+                                <w:b/>
+                                <w:bCs/>
+                                <w:sz w:val="18"/>
+                                <w:szCs w:val="18"/>
+                                <w:rtl/>
+                                <w:lang w:bidi="ar-EG"/>
+                              </w:rPr>
+                              <w:t>ـ</w:t>
+                            </w:r>
+                            <w:r>
+                              <w:rPr>
+                                <w:rFonts w:cs="Arial"/>
+                                <w:b/>
+                                <w:bCs/>
+                                <w:sz w:val="18"/>
+                                <w:szCs w:val="18"/>
+                                <w:rtl/>
+                                <w:lang w:bidi="ar-EG"/>
+                              </w:rPr>
+                              <w:t>ل</w:t>
+                            </w:r>
+                            <w:r>
+                              <w:rPr>
+                                <w:rFonts w:cs="Arial" w:hint="cs"/>
+                                <w:b/>
+                                <w:bCs/>
+                                <w:sz w:val="18"/>
+                                <w:szCs w:val="18"/>
+                                <w:rtl/>
+                                <w:lang w:bidi="ar-EG"/>
+                              </w:rPr>
+                              <w:t>ـ</w:t>
+                            </w:r>
+                            <w:r>
+                              <w:rPr>
+                                <w:rFonts w:cs="Arial"/>
+                                <w:b/>
+                                <w:bCs/>
+                                <w:sz w:val="18"/>
+                                <w:szCs w:val="18"/>
+                                <w:rtl/>
+                                <w:lang w:bidi="ar-EG"/>
+                              </w:rPr>
+                              <w:t>ي</w:t>
+                            </w:r>
+                            <w:r>
+                              <w:rPr>
+                                <w:rFonts w:cs="Arial" w:hint="cs"/>
+                                <w:b/>
+                                <w:bCs/>
+                                <w:sz w:val="18"/>
+                                <w:szCs w:val="18"/>
+                                <w:rtl/>
+                                <w:lang w:bidi="ar-EG"/>
+                              </w:rPr>
+                              <w:t>ـ</w:t>
+                            </w:r>
+                            <w:r>
+                              <w:rPr>
+                                <w:rFonts w:cs="Arial"/>
+                                <w:b/>
+                                <w:bCs/>
+                                <w:sz w:val="18"/>
+                                <w:szCs w:val="18"/>
+                                <w:rtl/>
+                                <w:lang w:bidi="ar-EG"/>
+                              </w:rPr>
+                              <w:t>ة</w:t>
+                            </w:r>
+                          </w:p>
+                          <w:p>
+                            <w:pPr>
+                              <w:jc w:val="center"/>
+                              <w:rPr>
+                                <w:rFonts w:cs="Arial"/>
+                                <w:sz w:val="18"/>
+                                <w:szCs w:val="18"/>
+                                <w:lang w:bidi="ar-EG"/>
+                              </w:rPr>
+                            </w:pPr>
                           </w:p>
                         </w:txbxContent>
                       </wps:txbx>
@@ -520,32 +1633,308 @@
           </mc:Choice>
           <mc:Fallback>
             <w:pict>
-              <v:shape w14:anchorId="4A628CF9" id="_x0000_s1028" type="#_x0000_t202" style="position:absolute;margin-left:101.8pt;margin-top:28.5pt;width:153pt;height:45.75pt;z-index:251665408;visibility:visible;mso-wrap-style:square;mso-width-percent:0;mso-height-percent:0;mso-wrap-distance-left:9pt;mso-wrap-distance-top:3.6pt;mso-wrap-distance-right:9pt;mso-wrap-distance-bottom:3.6pt;mso-position-horizontal:right;mso-position-horizontal-relative:margin;mso-position-vertical:absolute;mso-position-vertical-relative:text;mso-width-percent:0;mso-height-percent:0;mso-width-relative:margin;mso-height-relative:margin;v-text-anchor:middle" o:gfxdata="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" filled="f" stroked="f">
+              <v:shape w14:anchorId="2EFE6191" id="Text Box 11" o:spid="_x0000_s1029" type="#_x0000_t202" style="position:absolute;margin-left:0;margin-top:110.7pt;width:194.6pt;height:17.15pt;z-index:251685888;visibility:visible;mso-wrap-style:square;mso-width-percent:0;mso-height-percent:0;mso-wrap-distance-left:9pt;mso-wrap-distance-top:3.6pt;mso-wrap-distance-right:9pt;mso-wrap-distance-bottom:3.6pt;mso-position-horizontal:center;mso-position-horizontal-relative:margin;mso-position-vertical:absolute;mso-position-vertical-relative:text;mso-width-percent:0;mso-height-percent:0;mso-width-relative:margin;mso-height-relative:margin;v-text-anchor:middle" o:gfxdata="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" filled="f" stroked="f">
                 <v:textbox>
                   <w:txbxContent>
                     <w:p>
                       <w:pPr>
                         <w:jc w:val="center"/>
                         <w:rPr>
-                          <w:b/>
-                          <w:bCs/>
-                          <w:sz w:val="40"/>
-                          <w:szCs w:val="40"/>
+                          <w:rFonts w:cs="Arial"/>
+                          <w:b/>
+                          <w:bCs/>
+                          <w:sz w:val="18"/>
+                          <w:szCs w:val="18"/>
                           <w:lang w:bidi="ar-EG"/>
                         </w:rPr>
                       </w:pPr>
                       <w:r>
                         <w:rPr>
-                          <w:rFonts w:hint="cs"/>
-                          <w:b/>
-                          <w:bCs/>
-                          <w:sz w:val="40"/>
-                          <w:szCs w:val="40"/>
-                          <w:rtl/>
-                          <w:lang w:bidi="ar-EG"/>
-                        </w:rPr>
-                        <w:t>تقديم طالب جديد</w:t>
-                      </w:r>
+                          <w:rFonts w:cs="Arial"/>
+                          <w:b/>
+                          <w:bCs/>
+                          <w:sz w:val="18"/>
+                          <w:szCs w:val="18"/>
+                          <w:rtl/>
+                          <w:lang w:bidi="ar-EG"/>
+                        </w:rPr>
+                        <w:t>اتح</w:t>
+                      </w:r>
+                      <w:r>
+                        <w:rPr>
+                          <w:rFonts w:cs="Arial" w:hint="cs"/>
+                          <w:b/>
+                          <w:bCs/>
+                          <w:sz w:val="18"/>
+                          <w:szCs w:val="18"/>
+                          <w:rtl/>
+                          <w:lang w:bidi="ar-EG"/>
+                        </w:rPr>
+                        <w:t>ـ</w:t>
+                      </w:r>
+                      <w:r>
+                        <w:rPr>
+                          <w:rFonts w:cs="Arial"/>
+                          <w:b/>
+                          <w:bCs/>
+                          <w:sz w:val="18"/>
+                          <w:szCs w:val="18"/>
+                          <w:rtl/>
+                          <w:lang w:bidi="ar-EG"/>
+                        </w:rPr>
+                        <w:t>اد ط</w:t>
+                      </w:r>
+                      <w:r>
+                        <w:rPr>
+                          <w:rFonts w:cs="Arial" w:hint="cs"/>
+                          <w:b/>
+                          <w:bCs/>
+                          <w:sz w:val="18"/>
+                          <w:szCs w:val="18"/>
+                          <w:rtl/>
+                          <w:lang w:bidi="ar-EG"/>
+                        </w:rPr>
+                        <w:t>ـ</w:t>
+                      </w:r>
+                      <w:r>
+                        <w:rPr>
+                          <w:rFonts w:cs="Arial"/>
+                          <w:b/>
+                          <w:bCs/>
+                          <w:sz w:val="18"/>
+                          <w:szCs w:val="18"/>
+                          <w:rtl/>
+                          <w:lang w:bidi="ar-EG"/>
+                        </w:rPr>
+                        <w:t>لاب كل</w:t>
+                      </w:r>
+                      <w:r>
+                        <w:rPr>
+                          <w:rFonts w:cs="Arial" w:hint="cs"/>
+                          <w:b/>
+                          <w:bCs/>
+                          <w:sz w:val="18"/>
+                          <w:szCs w:val="18"/>
+                          <w:rtl/>
+                          <w:lang w:bidi="ar-EG"/>
+                        </w:rPr>
+                        <w:t>ـ</w:t>
+                      </w:r>
+                      <w:r>
+                        <w:rPr>
+                          <w:rFonts w:cs="Arial"/>
+                          <w:b/>
+                          <w:bCs/>
+                          <w:sz w:val="18"/>
+                          <w:szCs w:val="18"/>
+                          <w:rtl/>
+                          <w:lang w:bidi="ar-EG"/>
+                        </w:rPr>
+                        <w:t>ية اله</w:t>
+                      </w:r>
+                      <w:r>
+                        <w:rPr>
+                          <w:rFonts w:cs="Arial" w:hint="cs"/>
+                          <w:b/>
+                          <w:bCs/>
+                          <w:sz w:val="18"/>
+                          <w:szCs w:val="18"/>
+                          <w:rtl/>
+                          <w:lang w:bidi="ar-EG"/>
+                        </w:rPr>
+                        <w:t>ـ</w:t>
+                      </w:r>
+                      <w:r>
+                        <w:rPr>
+                          <w:rFonts w:cs="Arial"/>
+                          <w:b/>
+                          <w:bCs/>
+                          <w:sz w:val="18"/>
+                          <w:szCs w:val="18"/>
+                          <w:rtl/>
+                          <w:lang w:bidi="ar-EG"/>
+                        </w:rPr>
+                        <w:t>ندس</w:t>
+                      </w:r>
+                      <w:r>
+                        <w:rPr>
+                          <w:rFonts w:cs="Arial" w:hint="cs"/>
+                          <w:b/>
+                          <w:bCs/>
+                          <w:sz w:val="18"/>
+                          <w:szCs w:val="18"/>
+                          <w:rtl/>
+                          <w:lang w:bidi="ar-EG"/>
+                        </w:rPr>
+                        <w:t>ـ</w:t>
+                      </w:r>
+                      <w:r>
+                        <w:rPr>
+                          <w:rFonts w:cs="Arial"/>
+                          <w:b/>
+                          <w:bCs/>
+                          <w:sz w:val="18"/>
+                          <w:szCs w:val="18"/>
+                          <w:rtl/>
+                          <w:lang w:bidi="ar-EG"/>
+                        </w:rPr>
+                        <w:t>ة – ج</w:t>
+                      </w:r>
+                      <w:r>
+                        <w:rPr>
+                          <w:rFonts w:cs="Arial" w:hint="cs"/>
+                          <w:b/>
+                          <w:bCs/>
+                          <w:sz w:val="18"/>
+                          <w:szCs w:val="18"/>
+                          <w:rtl/>
+                          <w:lang w:bidi="ar-EG"/>
+                        </w:rPr>
+                        <w:t>ـ</w:t>
+                      </w:r>
+                      <w:r>
+                        <w:rPr>
+                          <w:rFonts w:cs="Arial"/>
+                          <w:b/>
+                          <w:bCs/>
+                          <w:sz w:val="18"/>
+                          <w:szCs w:val="18"/>
+                          <w:rtl/>
+                          <w:lang w:bidi="ar-EG"/>
+                        </w:rPr>
+                        <w:t>ام</w:t>
+                      </w:r>
+                      <w:r>
+                        <w:rPr>
+                          <w:rFonts w:cs="Arial" w:hint="cs"/>
+                          <w:b/>
+                          <w:bCs/>
+                          <w:sz w:val="18"/>
+                          <w:szCs w:val="18"/>
+                          <w:rtl/>
+                          <w:lang w:bidi="ar-EG"/>
+                        </w:rPr>
+                        <w:t>ـ</w:t>
+                      </w:r>
+                      <w:r>
+                        <w:rPr>
+                          <w:rFonts w:cs="Arial"/>
+                          <w:b/>
+                          <w:bCs/>
+                          <w:sz w:val="18"/>
+                          <w:szCs w:val="18"/>
+                          <w:rtl/>
+                          <w:lang w:bidi="ar-EG"/>
+                        </w:rPr>
+                        <w:t>عة الزق</w:t>
+                      </w:r>
+                      <w:r>
+                        <w:rPr>
+                          <w:rFonts w:cs="Arial" w:hint="cs"/>
+                          <w:b/>
+                          <w:bCs/>
+                          <w:sz w:val="18"/>
+                          <w:szCs w:val="18"/>
+                          <w:rtl/>
+                          <w:lang w:bidi="ar-EG"/>
+                        </w:rPr>
+                        <w:t>ـ</w:t>
+                      </w:r>
+                      <w:r>
+                        <w:rPr>
+                          <w:rFonts w:cs="Arial"/>
+                          <w:b/>
+                          <w:bCs/>
+                          <w:sz w:val="18"/>
+                          <w:szCs w:val="18"/>
+                          <w:rtl/>
+                          <w:lang w:bidi="ar-EG"/>
+                        </w:rPr>
+                        <w:t>ازيق الأه</w:t>
+                      </w:r>
+                      <w:r>
+                        <w:rPr>
+                          <w:rFonts w:cs="Arial" w:hint="cs"/>
+                          <w:b/>
+                          <w:bCs/>
+                          <w:sz w:val="18"/>
+                          <w:szCs w:val="18"/>
+                          <w:rtl/>
+                          <w:lang w:bidi="ar-EG"/>
+                        </w:rPr>
+                        <w:t>ـ</w:t>
+                      </w:r>
+                      <w:r>
+                        <w:rPr>
+                          <w:rFonts w:cs="Arial"/>
+                          <w:b/>
+                          <w:bCs/>
+                          <w:sz w:val="18"/>
+                          <w:szCs w:val="18"/>
+                          <w:rtl/>
+                          <w:lang w:bidi="ar-EG"/>
+                        </w:rPr>
+                        <w:t>ل</w:t>
+                      </w:r>
+                      <w:r>
+                        <w:rPr>
+                          <w:rFonts w:cs="Arial" w:hint="cs"/>
+                          <w:b/>
+                          <w:bCs/>
+                          <w:sz w:val="18"/>
+                          <w:szCs w:val="18"/>
+                          <w:rtl/>
+                          <w:lang w:bidi="ar-EG"/>
+                        </w:rPr>
+                        <w:t>ـ</w:t>
+                      </w:r>
+                      <w:r>
+                        <w:rPr>
+                          <w:rFonts w:cs="Arial"/>
+                          <w:b/>
+                          <w:bCs/>
+                          <w:sz w:val="18"/>
+                          <w:szCs w:val="18"/>
+                          <w:rtl/>
+                          <w:lang w:bidi="ar-EG"/>
+                        </w:rPr>
+                        <w:t>ي</w:t>
+                      </w:r>
+                      <w:r>
+                        <w:rPr>
+                          <w:rFonts w:cs="Arial" w:hint="cs"/>
+                          <w:b/>
+                          <w:bCs/>
+                          <w:sz w:val="18"/>
+                          <w:szCs w:val="18"/>
+                          <w:rtl/>
+                          <w:lang w:bidi="ar-EG"/>
+                        </w:rPr>
+                        <w:t>ـ</w:t>
+                      </w:r>
+                      <w:r>
+                        <w:rPr>
+                          <w:rFonts w:cs="Arial"/>
+                          <w:b/>
+                          <w:bCs/>
+                          <w:sz w:val="18"/>
+                          <w:szCs w:val="18"/>
+                          <w:rtl/>
+                          <w:lang w:bidi="ar-EG"/>
+                        </w:rPr>
+                        <w:t>ة</w:t>
+                      </w:r>
+                    </w:p>
+                    <w:p>
+                      <w:pPr>
+                        <w:jc w:val="center"/>
+                        <w:rPr>
+                          <w:rFonts w:cs="Arial"/>
+                          <w:sz w:val="18"/>
+                          <w:szCs w:val="18"/>
+                          <w:lang w:bidi="ar-EG"/>
+                        </w:rPr>
+                      </w:pPr>
                     </w:p>
                   </w:txbxContent>
                 </v:textbox>
@@ -555,7 +1944,509 @@
           </mc:Fallback>
         </mc:AlternateContent>
       </w:r>
+      <w:r>
+        <w:rPr>
+          <w:noProof/>
+        </w:rPr>
+        <w:drawing>
+          <wp:anchor distT="0" distB="0" distL="114300" distR="114300" simplePos="0" relativeHeight="251680768" behindDoc="1" locked="0" layoutInCell="1" allowOverlap="1" wp14:anchorId="6A15AE43" wp14:editId="193632DA">
+            <wp:simplePos x="0" y="0"/>
+            <wp:positionH relativeFrom="margin">
+              <wp:posOffset>267335</wp:posOffset>
+            </wp:positionH>
+            <wp:positionV relativeFrom="paragraph">
+              <wp:posOffset>626110</wp:posOffset>
+            </wp:positionV>
+            <wp:extent cx="569595" cy="569595"/>
+            <wp:effectExtent l="0" t="0" r="1905" b="1905"/>
+            <wp:wrapTight wrapText="bothSides">
+              <wp:wrapPolygon edited="0">
+                <wp:start x="0" y="0"/>
+                <wp:lineTo x="0" y="20950"/>
+                <wp:lineTo x="20950" y="20950"/>
+                <wp:lineTo x="20950" y="0"/>
+                <wp:lineTo x="0" y="0"/>
+              </wp:wrapPolygon>
+            </wp:wrapTight>
+            <wp:docPr id="6" name="Picture 6"/>
+            <wp:cNvGraphicFramePr>
+              <a:graphicFrameLocks xmlns:a="http://schemas.openxmlformats.org/drawingml/2006/main" noChangeAspect="1"/>
+            </wp:cNvGraphicFramePr>
+            <a:graphic xmlns:a="http://schemas.openxmlformats.org/drawingml/2006/main">
+              <a:graphicData uri="http://schemas.openxmlformats.org/drawingml/2006/picture">
+                <pic:pic xmlns:pic="http://schemas.openxmlformats.org/drawingml/2006/picture">
+                  <pic:nvPicPr>
+                    <pic:cNvPr id="0" name="Picture 2"/>
+                    <pic:cNvPicPr>
+                      <a:picLocks noChangeAspect="1" noChangeArrowheads="1"/>
+                    </pic:cNvPicPr>
+                  </pic:nvPicPr>
+                  <pic:blipFill>
+                    <a:blip r:embed="rId8" cstate="print">
+                      <a:extLst>
+                        <a:ext uri="{28A0092B-C50C-407E-A947-70E740481C1C}">
+                          <a14:useLocalDpi xmlns:a14="http://schemas.microsoft.com/office/drawing/2010/main" val="0"/>
+                        </a:ext>
+                      </a:extLst>
+                    </a:blip>
+                    <a:srcRect/>
+                    <a:stretch>
+                      <a:fillRect/>
+                    </a:stretch>
+                  </pic:blipFill>
+                  <pic:spPr bwMode="auto">
+                    <a:xfrm>
+                      <a:off x="0" y="0"/>
+                      <a:ext cx="569595" cy="569595"/>
+                    </a:xfrm>
+                    <a:prstGeom prst="rect">
+                      <a:avLst/>
+                    </a:prstGeom>
+                    <a:noFill/>
+                    <a:ln>
+                      <a:noFill/>
+                    </a:ln>
+                  </pic:spPr>
+                </pic:pic>
+              </a:graphicData>
+            </a:graphic>
+            <wp14:sizeRelH relativeFrom="margin">
+              <wp14:pctWidth>0</wp14:pctWidth>
+            </wp14:sizeRelH>
+            <wp14:sizeRelV relativeFrom="margin">
+              <wp14:pctHeight>0</wp14:pctHeight>
+            </wp14:sizeRelV>
+          </wp:anchor>
+        </w:drawing>
+      </w:r>
+      <w:r>
+        <w:rPr>
+          <w:noProof/>
+        </w:rPr>
+        <mc:AlternateContent>
+          <mc:Choice Requires="wps">
+            <w:drawing>
+              <wp:anchor distT="45720" distB="45720" distL="114300" distR="114300" simplePos="0" relativeHeight="251683840" behindDoc="0" locked="0" layoutInCell="1" allowOverlap="1" wp14:anchorId="63411FE6" wp14:editId="54C7CB93">
+                <wp:simplePos x="0" y="0"/>
+                <wp:positionH relativeFrom="margin">
+                  <wp:align>center</wp:align>
+                </wp:positionH>
+                <wp:positionV relativeFrom="paragraph">
+                  <wp:posOffset>1199515</wp:posOffset>
+                </wp:positionV>
+                <wp:extent cx="2471420" cy="220345"/>
+                <wp:effectExtent l="0" t="0" r="0" b="8255"/>
+                <wp:wrapSquare wrapText="bothSides"/>
+                <wp:docPr id="10" name="Text Box 10"/>
+                <wp:cNvGraphicFramePr>
+                  <a:graphicFrameLocks xmlns:a="http://schemas.openxmlformats.org/drawingml/2006/main"/>
+                </wp:cNvGraphicFramePr>
+                <a:graphic xmlns:a="http://schemas.openxmlformats.org/drawingml/2006/main">
+                  <a:graphicData uri="http://schemas.microsoft.com/office/word/2010/wordprocessingShape">
+                    <wps:wsp>
+                      <wps:cNvSpPr txBox="1">
+                        <a:spLocks noChangeArrowheads="1"/>
+                      </wps:cNvSpPr>
+                      <wps:spPr bwMode="auto">
+                        <a:xfrm>
+                          <a:off x="0" y="0"/>
+                          <a:ext cx="2471420" cy="220345"/>
+                        </a:xfrm>
+                        <a:prstGeom prst="rect">
+                          <a:avLst/>
+                        </a:prstGeom>
+                        <a:noFill/>
+                        <a:ln>
+                          <a:noFill/>
+                        </a:ln>
+                      </wps:spPr>
+                      <wps:style>
+                        <a:lnRef idx="0">
+                          <a:scrgbClr r="0" g="0" b="0"/>
+                        </a:lnRef>
+                        <a:fillRef idx="0">
+                          <a:scrgbClr r="0" g="0" b="0"/>
+                        </a:fillRef>
+                        <a:effectRef idx="0">
+                          <a:scrgbClr r="0" g="0" b="0"/>
+                        </a:effectRef>
+                        <a:fontRef idx="minor">
+                          <a:schemeClr val="dk1"/>
+                        </a:fontRef>
+                      </wps:style>
+                      <wps:txbx>
+                        <w:txbxContent>
+                          <w:p>
+                            <w:pPr>
+                              <w:jc w:val="center"/>
+                              <w:rPr>
+                                <w:rFonts w:cs="Arial"/>
+                                <w:sz w:val="18"/>
+                                <w:szCs w:val="18"/>
+                                <w:lang w:bidi="ar-EG"/>
+                              </w:rPr>
+                            </w:pPr>
+                            <w:r>
+                              <w:rPr>
+                                <w:rFonts w:cs="Arial" w:hint="cs"/>
+                                <w:sz w:val="18"/>
+                                <w:szCs w:val="18"/>
+                                <w:rtl/>
+                                <w:lang w:bidi="ar-EG"/>
+                              </w:rPr>
+                              <w:t>شكرا</w:t>
+                            </w:r>
+                            <w:r>
+                              <w:rPr>
+                                <w:rFonts w:cs="Arial"/>
+                                <w:sz w:val="18"/>
+                                <w:szCs w:val="18"/>
+                                <w:rtl/>
+                                <w:lang w:bidi="ar-EG"/>
+                              </w:rPr>
+                              <w:t xml:space="preserve"> </w:t>
+                            </w:r>
+                            <w:r>
+                              <w:rPr>
+                                <w:rFonts w:cs="Arial" w:hint="cs"/>
+                                <w:sz w:val="18"/>
+                                <w:szCs w:val="18"/>
+                                <w:rtl/>
+                                <w:lang w:bidi="ar-EG"/>
+                              </w:rPr>
+                              <w:t>لتعاونكم</w:t>
+                            </w:r>
+                            <w:r>
+                              <w:rPr>
+                                <w:rFonts w:cs="Arial"/>
+                                <w:sz w:val="18"/>
+                                <w:szCs w:val="18"/>
+                                <w:rtl/>
+                                <w:lang w:bidi="ar-EG"/>
+                              </w:rPr>
+                              <w:t xml:space="preserve">... </w:t>
+                            </w:r>
+                            <w:r>
+                              <w:rPr>
+                                <w:rFonts w:cs="Arial" w:hint="cs"/>
+                                <w:sz w:val="18"/>
+                                <w:szCs w:val="18"/>
+                                <w:rtl/>
+                                <w:lang w:bidi="ar-EG"/>
+                              </w:rPr>
+                              <w:t>تمنياتنا</w:t>
+                            </w:r>
+                            <w:r>
+                              <w:rPr>
+                                <w:rFonts w:cs="Arial"/>
+                                <w:sz w:val="18"/>
+                                <w:szCs w:val="18"/>
+                                <w:rtl/>
+                                <w:lang w:bidi="ar-EG"/>
+                              </w:rPr>
+                              <w:t xml:space="preserve"> </w:t>
+                            </w:r>
+                            <w:r>
+                              <w:rPr>
+                                <w:rFonts w:cs="Arial" w:hint="cs"/>
+                                <w:sz w:val="18"/>
+                                <w:szCs w:val="18"/>
+                                <w:rtl/>
+                                <w:lang w:bidi="ar-EG"/>
+                              </w:rPr>
+                              <w:t>لكم</w:t>
+                            </w:r>
+                            <w:r>
+                              <w:rPr>
+                                <w:rFonts w:cs="Arial"/>
+                                <w:sz w:val="18"/>
+                                <w:szCs w:val="18"/>
+                                <w:rtl/>
+                                <w:lang w:bidi="ar-EG"/>
+                              </w:rPr>
+                              <w:t xml:space="preserve"> </w:t>
+                            </w:r>
+                            <w:r>
+                              <w:rPr>
+                                <w:rFonts w:cs="Arial" w:hint="cs"/>
+                                <w:sz w:val="18"/>
+                                <w:szCs w:val="18"/>
+                                <w:rtl/>
+                                <w:lang w:bidi="ar-EG"/>
+                              </w:rPr>
+                              <w:t>بالتوفيق</w:t>
+                            </w:r>
+                            <w:r>
+                              <w:rPr>
+                                <w:rFonts w:cs="Arial"/>
+                                <w:sz w:val="18"/>
+                                <w:szCs w:val="18"/>
+                                <w:rtl/>
+                                <w:lang w:bidi="ar-EG"/>
+                              </w:rPr>
+                              <w:t xml:space="preserve"> </w:t>
+                            </w:r>
+                            <w:r>
+                              <w:rPr>
+                                <w:rFonts w:cs="Arial" w:hint="cs"/>
+                                <w:sz w:val="18"/>
+                                <w:szCs w:val="18"/>
+                                <w:rtl/>
+                                <w:lang w:bidi="ar-EG"/>
+                              </w:rPr>
+                              <w:t>والنجاح</w:t>
+                            </w:r>
+                          </w:p>
+                        </w:txbxContent>
+                      </wps:txbx>
+                      <wps:bodyPr rot="0" vert="horz" wrap="square" lIns="91440" tIns="45720" rIns="91440" bIns="45720" anchor="ctr" anchorCtr="0">
+                        <a:noAutofit/>
+                      </wps:bodyPr>
+                    </wps:wsp>
+                  </a:graphicData>
+                </a:graphic>
+                <wp14:sizeRelH relativeFrom="margin">
+                  <wp14:pctWidth>0</wp14:pctWidth>
+                </wp14:sizeRelH>
+                <wp14:sizeRelV relativeFrom="margin">
+                  <wp14:pctHeight>0</wp14:pctHeight>
+                </wp14:sizeRelV>
+              </wp:anchor>
+            </w:drawing>
+          </mc:Choice>
+          <mc:Fallback>
+            <w:pict>
+              <v:shape w14:anchorId="63411FE6" id="Text Box 10" o:spid="_x0000_s1030" type="#_x0000_t202" style="position:absolute;margin-left:0;margin-top:94.45pt;width:194.6pt;height:17.35pt;z-index:251683840;visibility:visible;mso-wrap-style:square;mso-width-percent:0;mso-height-percent:0;mso-wrap-distance-left:9pt;mso-wrap-distance-top:3.6pt;mso-wrap-distance-right:9pt;mso-wrap-distance-bottom:3.6pt;mso-position-horizontal:center;mso-position-horizontal-relative:margin;mso-position-vertical:absolute;mso-position-vertical-relative:text;mso-width-percent:0;mso-height-percent:0;mso-width-relative:margin;mso-height-relative:margin;v-text-anchor:middle" o:gfxdata="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" filled="f" stroked="f">
+                <v:textbox>
+                  <w:txbxContent>
+                    <w:p>
+                      <w:pPr>
+                        <w:jc w:val="center"/>
+                        <w:rPr>
+                          <w:rFonts w:cs="Arial"/>
+                          <w:sz w:val="18"/>
+                          <w:szCs w:val="18"/>
+                          <w:lang w:bidi="ar-EG"/>
+                        </w:rPr>
+                      </w:pPr>
+                      <w:r>
+                        <w:rPr>
+                          <w:rFonts w:cs="Arial" w:hint="cs"/>
+                          <w:sz w:val="18"/>
+                          <w:szCs w:val="18"/>
+                          <w:rtl/>
+                          <w:lang w:bidi="ar-EG"/>
+                        </w:rPr>
+                        <w:t>شكرا</w:t>
+                      </w:r>
+                      <w:r>
+                        <w:rPr>
+                          <w:rFonts w:cs="Arial"/>
+                          <w:sz w:val="18"/>
+                          <w:szCs w:val="18"/>
+                          <w:rtl/>
+                          <w:lang w:bidi="ar-EG"/>
+                        </w:rPr>
+                        <w:t xml:space="preserve"> </w:t>
+                      </w:r>
+                      <w:r>
+                        <w:rPr>
+                          <w:rFonts w:cs="Arial" w:hint="cs"/>
+                          <w:sz w:val="18"/>
+                          <w:szCs w:val="18"/>
+                          <w:rtl/>
+                          <w:lang w:bidi="ar-EG"/>
+                        </w:rPr>
+                        <w:t>لتعاونكم</w:t>
+                      </w:r>
+                      <w:r>
+                        <w:rPr>
+                          <w:rFonts w:cs="Arial"/>
+                          <w:sz w:val="18"/>
+                          <w:szCs w:val="18"/>
+                          <w:rtl/>
+                          <w:lang w:bidi="ar-EG"/>
+                        </w:rPr>
+                        <w:t xml:space="preserve">... </w:t>
+                      </w:r>
+                      <w:r>
+                        <w:rPr>
+                          <w:rFonts w:cs="Arial" w:hint="cs"/>
+                          <w:sz w:val="18"/>
+                          <w:szCs w:val="18"/>
+                          <w:rtl/>
+                          <w:lang w:bidi="ar-EG"/>
+                        </w:rPr>
+                        <w:t>تمنياتنا</w:t>
+                      </w:r>
+                      <w:r>
+                        <w:rPr>
+                          <w:rFonts w:cs="Arial"/>
+                          <w:sz w:val="18"/>
+                          <w:szCs w:val="18"/>
+                          <w:rtl/>
+                          <w:lang w:bidi="ar-EG"/>
+                        </w:rPr>
+                        <w:t xml:space="preserve"> </w:t>
+                      </w:r>
+                      <w:r>
+                        <w:rPr>
+                          <w:rFonts w:cs="Arial" w:hint="cs"/>
+                          <w:sz w:val="18"/>
+                          <w:szCs w:val="18"/>
+                          <w:rtl/>
+                          <w:lang w:bidi="ar-EG"/>
+                        </w:rPr>
+                        <w:t>لكم</w:t>
+                      </w:r>
+                      <w:r>
+                        <w:rPr>
+                          <w:rFonts w:cs="Arial"/>
+                          <w:sz w:val="18"/>
+                          <w:szCs w:val="18"/>
+                          <w:rtl/>
+                          <w:lang w:bidi="ar-EG"/>
+                        </w:rPr>
+                        <w:t xml:space="preserve"> </w:t>
+                      </w:r>
+                      <w:r>
+                        <w:rPr>
+                          <w:rFonts w:cs="Arial" w:hint="cs"/>
+                          <w:sz w:val="18"/>
+                          <w:szCs w:val="18"/>
+                          <w:rtl/>
+                          <w:lang w:bidi="ar-EG"/>
+                        </w:rPr>
+                        <w:t>بالتوفيق</w:t>
+                      </w:r>
+                      <w:r>
+                        <w:rPr>
+                          <w:rFonts w:cs="Arial"/>
+                          <w:sz w:val="18"/>
+                          <w:szCs w:val="18"/>
+                          <w:rtl/>
+                          <w:lang w:bidi="ar-EG"/>
+                        </w:rPr>
+                        <w:t xml:space="preserve"> </w:t>
+                      </w:r>
+                      <w:r>
+                        <w:rPr>
+                          <w:rFonts w:cs="Arial" w:hint="cs"/>
+                          <w:sz w:val="18"/>
+                          <w:szCs w:val="18"/>
+                          <w:rtl/>
+                          <w:lang w:bidi="ar-EG"/>
+                        </w:rPr>
+                        <w:t>والنجاح</w:t>
+                      </w:r>
+                    </w:p>
+                  </w:txbxContent>
+                </v:textbox>
+                <w10:wrap type="square" anchorx="margin"/>
+              </v:shape>
+            </w:pict>
+          </mc:Fallback>
+        </mc:AlternateContent>
+      </w:r>
+      <w:r>
+        <w:rPr>
+          <w:noProof/>
+        </w:rPr>
+        <w:drawing>
+          <wp:anchor distT="0" distB="0" distL="114300" distR="114300" simplePos="0" relativeHeight="251681792" behindDoc="1" locked="0" layoutInCell="1" allowOverlap="1" wp14:anchorId="64A479D9" wp14:editId="3E4D55E9">
+            <wp:simplePos x="0" y="0"/>
+            <wp:positionH relativeFrom="margin">
+              <wp:posOffset>1089660</wp:posOffset>
+            </wp:positionH>
+            <wp:positionV relativeFrom="paragraph">
+              <wp:posOffset>623570</wp:posOffset>
+            </wp:positionV>
+            <wp:extent cx="559435" cy="559435"/>
+            <wp:effectExtent l="0" t="0" r="0" b="0"/>
+            <wp:wrapTight wrapText="bothSides">
+              <wp:wrapPolygon edited="0">
+                <wp:start x="0" y="0"/>
+                <wp:lineTo x="0" y="20595"/>
+                <wp:lineTo x="20595" y="20595"/>
+                <wp:lineTo x="20595" y="0"/>
+                <wp:lineTo x="0" y="0"/>
+              </wp:wrapPolygon>
+            </wp:wrapTight>
+            <wp:docPr id="7" name="Picture 7"/>
+            <wp:cNvGraphicFramePr>
+              <a:graphicFrameLocks xmlns:a="http://schemas.openxmlformats.org/drawingml/2006/main" noChangeAspect="1"/>
+            </wp:cNvGraphicFramePr>
+            <a:graphic xmlns:a="http://schemas.openxmlformats.org/drawingml/2006/main">
+              <a:graphicData uri="http://schemas.openxmlformats.org/drawingml/2006/picture">
+                <pic:pic xmlns:pic="http://schemas.openxmlformats.org/drawingml/2006/picture">
+                  <pic:nvPicPr>
+                    <pic:cNvPr id="0" name="Picture 3"/>
+                    <pic:cNvPicPr>
+                      <a:picLocks noChangeAspect="1" noChangeArrowheads="1"/>
+                    </pic:cNvPicPr>
+                  </pic:nvPicPr>
+                  <pic:blipFill>
+                    <a:blip r:embed="rId9" cstate="print">
+                      <a:extLst>
+                        <a:ext uri="{28A0092B-C50C-407E-A947-70E740481C1C}">
+                          <a14:useLocalDpi xmlns:a14="http://schemas.microsoft.com/office/drawing/2010/main" val="0"/>
+                        </a:ext>
+                      </a:extLst>
+                    </a:blip>
+                    <a:srcRect/>
+                    <a:stretch>
+                      <a:fillRect/>
+                    </a:stretch>
+                  </pic:blipFill>
+                  <pic:spPr bwMode="auto">
+                    <a:xfrm>
+                      <a:off x="0" y="0"/>
+                      <a:ext cx="559435" cy="559435"/>
+                    </a:xfrm>
+                    <a:prstGeom prst="rect">
+                      <a:avLst/>
+                    </a:prstGeom>
+                    <a:noFill/>
+                    <a:ln>
+                      <a:noFill/>
+                    </a:ln>
+                  </pic:spPr>
+                </pic:pic>
+              </a:graphicData>
+            </a:graphic>
+            <wp14:sizeRelH relativeFrom="margin">
+              <wp14:pctWidth>0</wp14:pctWidth>
+            </wp14:sizeRelH>
+            <wp14:sizeRelV relativeFrom="margin">
+              <wp14:pctHeight>0</wp14:pctHeight>
+            </wp14:sizeRelV>
+          </wp:anchor>
+        </w:drawing>
+      </w:r>
     </w:p>
+    <w:p>
+      <w:pPr>
+        <w:rPr>
+          <w:rtl/>
+        </w:rPr>
+      </w:pPr>
+    </w:p>
+    <w:p>
+      <w:pPr>
+        <w:rPr>
+          <w:rtl/>
+        </w:rPr>
+      </w:pPr>
+    </w:p>
+    <w:p>
+      <w:pPr>
+        <w:jc w:val="center"/>
+        <w:rPr>
+          <w:rtl/>
+        </w:rPr>
+      </w:pPr>
+    </w:p>
+    <w:p/>
     <w:sectPr>
       <w:pgSz w:w="4535" w:h="16843" w:code="165"/>
       <w:pgMar w:top="720" w:right="720" w:bottom="720" w:left="720" w:header="720" w:footer="720" w:gutter="0"/>
@@ -567,7 +2458,7 @@
 </file>
 
 <file path=word/styles.xml><?xml version="1.0" encoding="utf-8"?>
-<w:styles xmlns:mc="http://schemas.openxmlformats.org/markup-compatibility/2006" xmlns:r="http://schemas.openxmlformats.org/officeDocument/2006/relationships" xmlns:w="http://schemas.openxmlformats.org/wordprocessingml/2006/main" xmlns:w14="http://schemas.microsoft.com/office/word/2010/wordml" xmlns:w15="http://schemas.microsoft.com/office/word/2012/wordml" xmlns:w16cex="http://schemas.microsoft.com/office/word/2018/wordml/cex" xmlns:w16cid="http://schemas.microsoft.com/office/word/2016/wordml/cid" xmlns:w16="http://schemas.microsoft.com/office/word/2018/wordml" xmlns:w16du="http://schemas.microsoft.com/office/word/2023/wordml/word16du" xmlns:w16sdtdh="http://schemas.microsoft.com/office/word/2020/wordml/sdtdatahash" xmlns:w16sdtfl="http://schemas.microsoft.com/office/word/2024/wordml/sdtformatlock" xmlns:w16se="http://schemas.microsoft.com/office/word/2015/wordml/symex" mc:Ignorable="w14 w15 w16se w16cid w16 w16cex w16sdtdh w16sdtfl w16du">
+<w:styles xmlns:mc="http://schemas.openxmlformats.org/markup-compatibility/2006" xmlns:r="http://schemas.openxmlformats.org/officeDocument/2006/relationships" xmlns:w="http://schemas.openxmlformats.org/wordprocessingml/2006/main" xmlns:w14="http://schemas.microsoft.com/office/word/2010/wordml" xmlns:w15="http://schemas.microsoft.com/office/word/2012/wordml" xmlns:w16cex="http://schemas.microsoft.com/office/word/2018/wordml/cex" xmlns:w16cid="http://schemas.microsoft.com/office/word/2016/wordml/cid" xmlns:w16="http://schemas.microsoft.com/office/word/2018/wordml" xmlns:w16sdtdh="http://schemas.microsoft.com/office/word/2020/wordml/sdtdatahash" xmlns:w16se="http://schemas.microsoft.com/office/word/2015/wordml/symex" mc:Ignorable="w14 w15 w16se w16cid w16 w16cex w16sdtdh">
   <w:docDefaults>
     <w:rPrDefault>
       <w:rPr>
@@ -1170,7 +3061,6 @@
   <w:style w:type="character" w:default="1" w:styleId="DefaultParagraphFont">
     <w:name w:val="Default Paragraph Font"/>
     <w:uiPriority w:val="1"/>
-    <w:semiHidden/>
     <w:unhideWhenUsed/>
   </w:style>
   <w:style w:type="table" w:default="1" w:styleId="TableNormal">

</xml_diff>